<commit_message>
fix: perbaiki chat lintas akun dan presence
</commit_message>
<xml_diff>
--- a/docs/Laporan_Tahap_2_dan_3_TEMU_UIN_Malang.docx
+++ b/docs/Laporan_Tahap_2_dan_3_TEMU_UIN_Malang.docx
@@ -523,7 +523,7 @@
                 <w:color w:val="14231D"/>
                 <w:sz w:val="18"/>
               </w:rPr>
-              <w:t>7 Oktober 2026</w:t>
+              <w:t>9 Oktober 2026</w:t>
             </w:r>
           </w:p>
         </w:tc>
@@ -562,12 +562,12 @@
     </w:p>
     <w:p>
       <w:r>
-        <w:t>TEMU UIN Malang adalah aplikasi Lost &amp; Found kampus yang membantu mahasiswa melaporkan barang hilang atau ditemukan, mencari laporan, berkomunikasi melalui chat, dan memantau proses klaim. Aplikasi menggunakan Flutter untuk antarmuka lintas platform, REST API PHP sebagai layanan backend, MySQL/MariaDB sebagai database utama, dan Hive sebagai cache atau fallback lokal.</w:t>
+        <w:t>TEMU UIN Malang adalah aplikasi Lost &amp; Found kampus yang membantu mahasiswa melaporkan barang hilang atau ditemukan, mencari laporan, berkomunikasi melalui chat, dan memantau proses klaim. Aplikasi menggunakan Flutter untuk antarmuka lintas platform, REST API PHP sebagai layanan backend, MySQL/MariaDB sebagai database utama, dan Hive untuk penyimpanan lokal perangkat.</w:t>
       </w:r>
     </w:p>
     <w:p>
       <w:r>
-        <w:t>MVP yang dihasilkan telah mencakup autentikasi mahasiswa berbasis email resmi UIN Malang, login admin terpisah, dashboard, laporan, upload foto, chat, notifikasi popup, badge jumlah pesan, status online/last seen, database, validasi masukan, pengujian, serta repository Git.</w:t>
+        <w:t>MVP yang dihasilkan telah mencakup login mahasiswa berbasis email resmi UIN Malang dengan identitas email, NIM, dan nama yang terkunci, login admin terpisah, dashboard, laporan bersama, upload foto, chat antaranggota, notifikasi, badge jumlah pesan, status online/last seen dari backend, database, validasi, pengujian, serta repository Git. Sinkronisasi data berjalan berkala melalui API.</w:t>
       </w:r>
     </w:p>
     <w:p>
@@ -1183,7 +1183,7 @@
                 <w:color w:val="14231D"/>
                 <w:sz w:val="14"/>
               </w:rPr>
-              <w:t>Login mahasiswa dengan format NIM@student.uin-malang.ac.id</w:t>
+              <w:t>Login email kampus; satu email terikat pada satu NIM dan nama</w:t>
             </w:r>
           </w:p>
         </w:tc>
@@ -1735,7 +1735,7 @@
                 <w:color w:val="14231D"/>
                 <w:sz w:val="14"/>
               </w:rPr>
-              <w:t>Membuka chat, mengirim pesan, dan melihat online/last seen</w:t>
+              <w:t>Chat antaranggota laporan, kirim pesan, dan lihat online/last seen</w:t>
             </w:r>
           </w:p>
         </w:tc>
@@ -1954,6 +1954,190 @@
           </w:p>
         </w:tc>
       </w:tr>
+      <w:tr>
+        <w:tc>
+          <w:tcPr>
+            <w:tcW w:type="dxa" w:w="1134"/>
+            <w:vAlign w:val="center"/>
+            <w:shd w:fill="FFFFFF"/>
+            <w:tcBorders>
+              <w:top w:val="single" w:sz="8" w:color="D9E5DE"/>
+              <w:left w:val="single" w:sz="8" w:color="D9E5DE"/>
+              <w:bottom w:val="single" w:sz="8" w:color="D9E5DE"/>
+              <w:right w:val="single" w:sz="8" w:color="D9E5DE"/>
+              <w:insideH w:val="single" w:sz="8" w:color="D9E5DE"/>
+              <w:insideV w:val="single" w:sz="8" w:color="D9E5DE"/>
+            </w:tcBorders>
+          </w:tcPr>
+          <w:p>
+            <w:pPr>
+              <w:spacing w:after="0"/>
+            </w:pPr>
+            <w:r/>
+            <w:r>
+              <w:rPr>
+                <w:rFonts w:ascii="Arial" w:hAnsi="Arial"/>
+                <w:b w:val="0"/>
+                <w:color w:val="14231D"/>
+                <w:sz w:val="14"/>
+              </w:rPr>
+              <w:t>F-10</w:t>
+            </w:r>
+          </w:p>
+        </w:tc>
+        <w:tc>
+          <w:tcPr>
+            <w:tcW w:type="dxa" w:w="5669"/>
+            <w:vAlign w:val="center"/>
+            <w:shd w:fill="FFFFFF"/>
+            <w:tcBorders>
+              <w:top w:val="single" w:sz="8" w:color="D9E5DE"/>
+              <w:left w:val="single" w:sz="8" w:color="D9E5DE"/>
+              <w:bottom w:val="single" w:sz="8" w:color="D9E5DE"/>
+              <w:right w:val="single" w:sz="8" w:color="D9E5DE"/>
+              <w:insideH w:val="single" w:sz="8" w:color="D9E5DE"/>
+              <w:insideV w:val="single" w:sz="8" w:color="D9E5DE"/>
+            </w:tcBorders>
+          </w:tcPr>
+          <w:p>
+            <w:pPr>
+              <w:spacing w:after="0"/>
+            </w:pPr>
+            <w:r/>
+            <w:r>
+              <w:rPr>
+                <w:rFonts w:ascii="Arial" w:hAnsi="Arial"/>
+                <w:b w:val="0"/>
+                <w:color w:val="14231D"/>
+                <w:sz w:val="14"/>
+              </w:rPr>
+              <w:t>Melihat laporan dari semua akun dan menghapus laporan milik sendiri</w:t>
+            </w:r>
+          </w:p>
+        </w:tc>
+        <w:tc>
+          <w:tcPr>
+            <w:tcW w:type="dxa" w:w="1701"/>
+            <w:vAlign w:val="center"/>
+            <w:shd w:fill="FFFFFF"/>
+            <w:tcBorders>
+              <w:top w:val="single" w:sz="8" w:color="D9E5DE"/>
+              <w:left w:val="single" w:sz="8" w:color="D9E5DE"/>
+              <w:bottom w:val="single" w:sz="8" w:color="D9E5DE"/>
+              <w:right w:val="single" w:sz="8" w:color="D9E5DE"/>
+              <w:insideH w:val="single" w:sz="8" w:color="D9E5DE"/>
+              <w:insideV w:val="single" w:sz="8" w:color="D9E5DE"/>
+            </w:tcBorders>
+          </w:tcPr>
+          <w:p>
+            <w:pPr>
+              <w:spacing w:after="0"/>
+            </w:pPr>
+            <w:r/>
+            <w:r>
+              <w:rPr>
+                <w:rFonts w:ascii="Arial" w:hAnsi="Arial"/>
+                <w:b w:val="0"/>
+                <w:color w:val="14231D"/>
+                <w:sz w:val="14"/>
+              </w:rPr>
+              <w:t>Mahasiswa</w:t>
+            </w:r>
+          </w:p>
+        </w:tc>
+      </w:tr>
+      <w:tr>
+        <w:tc>
+          <w:tcPr>
+            <w:tcW w:type="dxa" w:w="1134"/>
+            <w:vAlign w:val="center"/>
+            <w:shd w:fill="F7F5EE"/>
+            <w:tcBorders>
+              <w:top w:val="single" w:sz="8" w:color="D9E5DE"/>
+              <w:left w:val="single" w:sz="8" w:color="D9E5DE"/>
+              <w:bottom w:val="single" w:sz="8" w:color="D9E5DE"/>
+              <w:right w:val="single" w:sz="8" w:color="D9E5DE"/>
+              <w:insideH w:val="single" w:sz="8" w:color="D9E5DE"/>
+              <w:insideV w:val="single" w:sz="8" w:color="D9E5DE"/>
+            </w:tcBorders>
+          </w:tcPr>
+          <w:p>
+            <w:pPr>
+              <w:spacing w:after="0"/>
+            </w:pPr>
+            <w:r/>
+            <w:r>
+              <w:rPr>
+                <w:rFonts w:ascii="Arial" w:hAnsi="Arial"/>
+                <w:b w:val="0"/>
+                <w:color w:val="14231D"/>
+                <w:sz w:val="14"/>
+              </w:rPr>
+              <w:t>F-11</w:t>
+            </w:r>
+          </w:p>
+        </w:tc>
+        <w:tc>
+          <w:tcPr>
+            <w:tcW w:type="dxa" w:w="5669"/>
+            <w:vAlign w:val="center"/>
+            <w:shd w:fill="F7F5EE"/>
+            <w:tcBorders>
+              <w:top w:val="single" w:sz="8" w:color="D9E5DE"/>
+              <w:left w:val="single" w:sz="8" w:color="D9E5DE"/>
+              <w:bottom w:val="single" w:sz="8" w:color="D9E5DE"/>
+              <w:right w:val="single" w:sz="8" w:color="D9E5DE"/>
+              <w:insideH w:val="single" w:sz="8" w:color="D9E5DE"/>
+              <w:insideV w:val="single" w:sz="8" w:color="D9E5DE"/>
+            </w:tcBorders>
+          </w:tcPr>
+          <w:p>
+            <w:pPr>
+              <w:spacing w:after="0"/>
+            </w:pPr>
+            <w:r/>
+            <w:r>
+              <w:rPr>
+                <w:rFonts w:ascii="Arial" w:hAnsi="Arial"/>
+                <w:b w:val="0"/>
+                <w:color w:val="14231D"/>
+                <w:sz w:val="14"/>
+              </w:rPr>
+              <w:t>Sinkronisasi laporan, chat, dan notifikasi berkala dari backend</w:t>
+            </w:r>
+          </w:p>
+        </w:tc>
+        <w:tc>
+          <w:tcPr>
+            <w:tcW w:type="dxa" w:w="1701"/>
+            <w:vAlign w:val="center"/>
+            <w:shd w:fill="F7F5EE"/>
+            <w:tcBorders>
+              <w:top w:val="single" w:sz="8" w:color="D9E5DE"/>
+              <w:left w:val="single" w:sz="8" w:color="D9E5DE"/>
+              <w:bottom w:val="single" w:sz="8" w:color="D9E5DE"/>
+              <w:right w:val="single" w:sz="8" w:color="D9E5DE"/>
+              <w:insideH w:val="single" w:sz="8" w:color="D9E5DE"/>
+              <w:insideV w:val="single" w:sz="8" w:color="D9E5DE"/>
+            </w:tcBorders>
+          </w:tcPr>
+          <w:p>
+            <w:pPr>
+              <w:spacing w:after="0"/>
+            </w:pPr>
+            <w:r/>
+            <w:r>
+              <w:rPr>
+                <w:rFonts w:ascii="Arial" w:hAnsi="Arial"/>
+                <w:b w:val="0"/>
+                <w:color w:val="14231D"/>
+                <w:sz w:val="14"/>
+              </w:rPr>
+              <w:t>Mahasiswa</w:t>
+            </w:r>
+          </w:p>
+        </w:tc>
+      </w:tr>
     </w:tbl>
     <w:p>
       <w:pPr>
@@ -2010,7 +2194,7 @@
         <w:spacing w:after="40"/>
       </w:pPr>
       <w:r>
-        <w:t>Keandalan data: MySQL/MariaDB menjadi penyimpanan utama dan Hive menjadi fallback lokal.</w:t>
+        <w:t>Keandalan data: MySQL/MariaDB menjadi sumber data bersama; cache lokal tidak ditampilkan lintas akun saat API gagal.</w:t>
       </w:r>
     </w:p>
     <w:p>
@@ -2300,7 +2484,7 @@
                 <w:color w:val="14231D"/>
                 <w:sz w:val="14"/>
               </w:rPr>
-              <w:t>Mahasiswa mengisi nama dan email kampus yang valid.</w:t>
+              <w:t>Mahasiswa memasukkan nama dan email kampus; identitas harus sama dengan yang terdaftar.</w:t>
             </w:r>
           </w:p>
         </w:tc>
@@ -2330,7 +2514,7 @@
                 <w:color w:val="14231D"/>
                 <w:sz w:val="14"/>
               </w:rPr>
-              <w:t>Masuk ke dashboard mahasiswa</w:t>
+              <w:t>Masuk ke dashboard; identitas berbeda ditolak</w:t>
             </w:r>
           </w:p>
         </w:tc>
@@ -3067,6 +3251,250 @@
           </w:p>
         </w:tc>
       </w:tr>
+      <w:tr>
+        <w:tc>
+          <w:tcPr>
+            <w:tcW w:type="dxa" w:w="1134"/>
+            <w:vAlign w:val="center"/>
+            <w:shd w:fill="FFFFFF"/>
+            <w:tcBorders>
+              <w:top w:val="single" w:sz="8" w:color="D9E5DE"/>
+              <w:left w:val="single" w:sz="8" w:color="D9E5DE"/>
+              <w:bottom w:val="single" w:sz="8" w:color="D9E5DE"/>
+              <w:right w:val="single" w:sz="8" w:color="D9E5DE"/>
+              <w:insideH w:val="single" w:sz="8" w:color="D9E5DE"/>
+              <w:insideV w:val="single" w:sz="8" w:color="D9E5DE"/>
+            </w:tcBorders>
+          </w:tcPr>
+          <w:p>
+            <w:pPr>
+              <w:spacing w:after="0"/>
+            </w:pPr>
+            <w:r/>
+            <w:r>
+              <w:rPr>
+                <w:rFonts w:ascii="Arial" w:hAnsi="Arial"/>
+                <w:b w:val="0"/>
+                <w:color w:val="14231D"/>
+                <w:sz w:val="14"/>
+              </w:rPr>
+              <w:t>UC-08</w:t>
+            </w:r>
+          </w:p>
+        </w:tc>
+        <w:tc>
+          <w:tcPr>
+            <w:tcW w:type="dxa" w:w="1701"/>
+            <w:vAlign w:val="center"/>
+            <w:shd w:fill="FFFFFF"/>
+            <w:tcBorders>
+              <w:top w:val="single" w:sz="8" w:color="D9E5DE"/>
+              <w:left w:val="single" w:sz="8" w:color="D9E5DE"/>
+              <w:bottom w:val="single" w:sz="8" w:color="D9E5DE"/>
+              <w:right w:val="single" w:sz="8" w:color="D9E5DE"/>
+              <w:insideH w:val="single" w:sz="8" w:color="D9E5DE"/>
+              <w:insideV w:val="single" w:sz="8" w:color="D9E5DE"/>
+            </w:tcBorders>
+          </w:tcPr>
+          <w:p>
+            <w:pPr>
+              <w:spacing w:after="0"/>
+            </w:pPr>
+            <w:r/>
+            <w:r>
+              <w:rPr>
+                <w:rFonts w:ascii="Arial" w:hAnsi="Arial"/>
+                <w:b w:val="0"/>
+                <w:color w:val="14231D"/>
+                <w:sz w:val="14"/>
+              </w:rPr>
+              <w:t>Interaksi lintas akun</w:t>
+            </w:r>
+          </w:p>
+        </w:tc>
+        <w:tc>
+          <w:tcPr>
+            <w:tcW w:type="dxa" w:w="4535"/>
+            <w:vAlign w:val="center"/>
+            <w:shd w:fill="FFFFFF"/>
+            <w:tcBorders>
+              <w:top w:val="single" w:sz="8" w:color="D9E5DE"/>
+              <w:left w:val="single" w:sz="8" w:color="D9E5DE"/>
+              <w:bottom w:val="single" w:sz="8" w:color="D9E5DE"/>
+              <w:right w:val="single" w:sz="8" w:color="D9E5DE"/>
+              <w:insideH w:val="single" w:sz="8" w:color="D9E5DE"/>
+              <w:insideV w:val="single" w:sz="8" w:color="D9E5DE"/>
+            </w:tcBorders>
+          </w:tcPr>
+          <w:p>
+            <w:pPr>
+              <w:spacing w:after="0"/>
+            </w:pPr>
+            <w:r/>
+            <w:r>
+              <w:rPr>
+                <w:rFonts w:ascii="Arial" w:hAnsi="Arial"/>
+                <w:b w:val="0"/>
+                <w:color w:val="14231D"/>
+                <w:sz w:val="14"/>
+              </w:rPr>
+              <w:t>Pengguna membuka laporan milik pengguna lain dan memulai percakapan.</w:t>
+            </w:r>
+          </w:p>
+        </w:tc>
+        <w:tc>
+          <w:tcPr>
+            <w:tcW w:type="dxa" w:w="1701"/>
+            <w:vAlign w:val="center"/>
+            <w:shd w:fill="FFFFFF"/>
+            <w:tcBorders>
+              <w:top w:val="single" w:sz="8" w:color="D9E5DE"/>
+              <w:left w:val="single" w:sz="8" w:color="D9E5DE"/>
+              <w:bottom w:val="single" w:sz="8" w:color="D9E5DE"/>
+              <w:right w:val="single" w:sz="8" w:color="D9E5DE"/>
+              <w:insideH w:val="single" w:sz="8" w:color="D9E5DE"/>
+              <w:insideV w:val="single" w:sz="8" w:color="D9E5DE"/>
+            </w:tcBorders>
+          </w:tcPr>
+          <w:p>
+            <w:pPr>
+              <w:spacing w:after="0"/>
+            </w:pPr>
+            <w:r/>
+            <w:r>
+              <w:rPr>
+                <w:rFonts w:ascii="Arial" w:hAnsi="Arial"/>
+                <w:b w:val="0"/>
+                <w:color w:val="14231D"/>
+                <w:sz w:val="14"/>
+              </w:rPr>
+              <w:t>Anggota melihat pesan dan notifikasi dari server bersama</w:t>
+            </w:r>
+          </w:p>
+        </w:tc>
+      </w:tr>
+      <w:tr>
+        <w:tc>
+          <w:tcPr>
+            <w:tcW w:type="dxa" w:w="1134"/>
+            <w:vAlign w:val="center"/>
+            <w:shd w:fill="F7F5EE"/>
+            <w:tcBorders>
+              <w:top w:val="single" w:sz="8" w:color="D9E5DE"/>
+              <w:left w:val="single" w:sz="8" w:color="D9E5DE"/>
+              <w:bottom w:val="single" w:sz="8" w:color="D9E5DE"/>
+              <w:right w:val="single" w:sz="8" w:color="D9E5DE"/>
+              <w:insideH w:val="single" w:sz="8" w:color="D9E5DE"/>
+              <w:insideV w:val="single" w:sz="8" w:color="D9E5DE"/>
+            </w:tcBorders>
+          </w:tcPr>
+          <w:p>
+            <w:pPr>
+              <w:spacing w:after="0"/>
+            </w:pPr>
+            <w:r/>
+            <w:r>
+              <w:rPr>
+                <w:rFonts w:ascii="Arial" w:hAnsi="Arial"/>
+                <w:b w:val="0"/>
+                <w:color w:val="14231D"/>
+                <w:sz w:val="14"/>
+              </w:rPr>
+              <w:t>UC-09</w:t>
+            </w:r>
+          </w:p>
+        </w:tc>
+        <w:tc>
+          <w:tcPr>
+            <w:tcW w:type="dxa" w:w="1701"/>
+            <w:vAlign w:val="center"/>
+            <w:shd w:fill="F7F5EE"/>
+            <w:tcBorders>
+              <w:top w:val="single" w:sz="8" w:color="D9E5DE"/>
+              <w:left w:val="single" w:sz="8" w:color="D9E5DE"/>
+              <w:bottom w:val="single" w:sz="8" w:color="D9E5DE"/>
+              <w:right w:val="single" w:sz="8" w:color="D9E5DE"/>
+              <w:insideH w:val="single" w:sz="8" w:color="D9E5DE"/>
+              <w:insideV w:val="single" w:sz="8" w:color="D9E5DE"/>
+            </w:tcBorders>
+          </w:tcPr>
+          <w:p>
+            <w:pPr>
+              <w:spacing w:after="0"/>
+            </w:pPr>
+            <w:r/>
+            <w:r>
+              <w:rPr>
+                <w:rFonts w:ascii="Arial" w:hAnsi="Arial"/>
+                <w:b w:val="0"/>
+                <w:color w:val="14231D"/>
+                <w:sz w:val="14"/>
+              </w:rPr>
+              <w:t>Hapus laporan</w:t>
+            </w:r>
+          </w:p>
+        </w:tc>
+        <w:tc>
+          <w:tcPr>
+            <w:tcW w:type="dxa" w:w="4535"/>
+            <w:vAlign w:val="center"/>
+            <w:shd w:fill="F7F5EE"/>
+            <w:tcBorders>
+              <w:top w:val="single" w:sz="8" w:color="D9E5DE"/>
+              <w:left w:val="single" w:sz="8" w:color="D9E5DE"/>
+              <w:bottom w:val="single" w:sz="8" w:color="D9E5DE"/>
+              <w:right w:val="single" w:sz="8" w:color="D9E5DE"/>
+              <w:insideH w:val="single" w:sz="8" w:color="D9E5DE"/>
+              <w:insideV w:val="single" w:sz="8" w:color="D9E5DE"/>
+            </w:tcBorders>
+          </w:tcPr>
+          <w:p>
+            <w:pPr>
+              <w:spacing w:after="0"/>
+            </w:pPr>
+            <w:r/>
+            <w:r>
+              <w:rPr>
+                <w:rFonts w:ascii="Arial" w:hAnsi="Arial"/>
+                <w:b w:val="0"/>
+                <w:color w:val="14231D"/>
+                <w:sz w:val="14"/>
+              </w:rPr>
+              <w:t>Pemilik memilih hapus pada detail laporan dan mengonfirmasi.</w:t>
+            </w:r>
+          </w:p>
+        </w:tc>
+        <w:tc>
+          <w:tcPr>
+            <w:tcW w:type="dxa" w:w="1701"/>
+            <w:vAlign w:val="center"/>
+            <w:shd w:fill="F7F5EE"/>
+            <w:tcBorders>
+              <w:top w:val="single" w:sz="8" w:color="D9E5DE"/>
+              <w:left w:val="single" w:sz="8" w:color="D9E5DE"/>
+              <w:bottom w:val="single" w:sz="8" w:color="D9E5DE"/>
+              <w:right w:val="single" w:sz="8" w:color="D9E5DE"/>
+              <w:insideH w:val="single" w:sz="8" w:color="D9E5DE"/>
+              <w:insideV w:val="single" w:sz="8" w:color="D9E5DE"/>
+            </w:tcBorders>
+          </w:tcPr>
+          <w:p>
+            <w:pPr>
+              <w:spacing w:after="0"/>
+            </w:pPr>
+            <w:r/>
+            <w:r>
+              <w:rPr>
+                <w:rFonts w:ascii="Arial" w:hAnsi="Arial"/>
+                <w:b w:val="0"/>
+                <w:color w:val="14231D"/>
+                <w:sz w:val="14"/>
+              </w:rPr>
+              <w:t>Laporan terhapus untuk semua akun; akun lain ditolak</w:t>
+            </w:r>
+          </w:p>
+        </w:tc>
+      </w:tr>
     </w:tbl>
     <w:p>
       <w:pPr>
@@ -3348,7 +3776,7 @@
                 <w:color w:val="14231D"/>
                 <w:sz w:val="16"/>
               </w:rPr>
-              <w:t>id, nim, email, nama</w:t>
+              <w:t>nim UNIQUE, email UNIQUE, nama</w:t>
             </w:r>
           </w:p>
         </w:tc>
@@ -3378,7 +3806,7 @@
                 <w:color w:val="14231D"/>
                 <w:sz w:val="16"/>
               </w:rPr>
-              <w:t>Menyimpan identitas mahasiswa yang login</w:t>
+              <w:t>Menyimpan identitas tunggal; email tidak dapat dipakai dengan NIM/nama lain</w:t>
             </w:r>
           </w:p>
         </w:tc>
@@ -3440,7 +3868,7 @@
                 <w:color w:val="14231D"/>
                 <w:sz w:val="16"/>
               </w:rPr>
-              <w:t>id, nama, lokasi, jenis, pelapor, status, foto</w:t>
+              <w:t>id, user_email, nama, lokasi, jenis, status, foto</w:t>
             </w:r>
           </w:p>
         </w:tc>
@@ -3470,7 +3898,7 @@
                 <w:color w:val="14231D"/>
                 <w:sz w:val="16"/>
               </w:rPr>
-              <w:t>Menyimpan laporan barang</w:t>
+              <w:t>Menyimpan laporan bersama beserta pemiliknya</w:t>
             </w:r>
           </w:p>
         </w:tc>
@@ -3532,7 +3960,7 @@
                 <w:color w:val="14231D"/>
                 <w:sz w:val="16"/>
               </w:rPr>
-              <w:t>id, barang_id, owner_email, is_online, unread_count</w:t>
+              <w:t>id, barang_id, owner_email, unread_count</w:t>
             </w:r>
           </w:p>
         </w:tc>
@@ -3562,7 +3990,7 @@
                 <w:color w:val="14231D"/>
                 <w:sz w:val="16"/>
               </w:rPr>
-              <w:t>Menyimpan sesi percakapan</w:t>
+              <w:t>Menyimpan sesi chat terkait laporan</w:t>
             </w:r>
           </w:p>
         </w:tc>
@@ -3594,7 +4022,7 @@
                 <w:color w:val="14231D"/>
                 <w:sz w:val="16"/>
               </w:rPr>
-              <w:t>messages</w:t>
+              <w:t>chat_members</w:t>
             </w:r>
           </w:p>
         </w:tc>
@@ -3624,7 +4052,7 @@
                 <w:color w:val="14231D"/>
                 <w:sz w:val="16"/>
               </w:rPr>
-              <w:t>chat_id, pengirim, teks, waktu, is_me</w:t>
+              <w:t>chat_id, email</w:t>
             </w:r>
           </w:p>
         </w:tc>
@@ -3654,7 +4082,191 @@
                 <w:color w:val="14231D"/>
                 <w:sz w:val="16"/>
               </w:rPr>
-              <w:t>Menyimpan isi pesan</w:t>
+              <w:t>Menentukan akun yang dapat melihat percakapan</w:t>
+            </w:r>
+          </w:p>
+        </w:tc>
+      </w:tr>
+      <w:tr>
+        <w:tc>
+          <w:tcPr>
+            <w:tcW w:type="dxa" w:w="1701"/>
+            <w:vAlign w:val="center"/>
+            <w:shd w:fill="F7F5EE"/>
+            <w:tcBorders>
+              <w:top w:val="single" w:sz="8" w:color="D9E5DE"/>
+              <w:left w:val="single" w:sz="8" w:color="D9E5DE"/>
+              <w:bottom w:val="single" w:sz="8" w:color="D9E5DE"/>
+              <w:right w:val="single" w:sz="8" w:color="D9E5DE"/>
+              <w:insideH w:val="single" w:sz="8" w:color="D9E5DE"/>
+              <w:insideV w:val="single" w:sz="8" w:color="D9E5DE"/>
+            </w:tcBorders>
+          </w:tcPr>
+          <w:p>
+            <w:pPr>
+              <w:spacing w:after="0"/>
+            </w:pPr>
+            <w:r/>
+            <w:r>
+              <w:rPr>
+                <w:rFonts w:ascii="Arial" w:hAnsi="Arial"/>
+                <w:b w:val="0"/>
+                <w:color w:val="14231D"/>
+                <w:sz w:val="16"/>
+              </w:rPr>
+              <w:t>messages</w:t>
+            </w:r>
+          </w:p>
+        </w:tc>
+        <w:tc>
+          <w:tcPr>
+            <w:tcW w:type="dxa" w:w="4535"/>
+            <w:vAlign w:val="center"/>
+            <w:shd w:fill="F7F5EE"/>
+            <w:tcBorders>
+              <w:top w:val="single" w:sz="8" w:color="D9E5DE"/>
+              <w:left w:val="single" w:sz="8" w:color="D9E5DE"/>
+              <w:bottom w:val="single" w:sz="8" w:color="D9E5DE"/>
+              <w:right w:val="single" w:sz="8" w:color="D9E5DE"/>
+              <w:insideH w:val="single" w:sz="8" w:color="D9E5DE"/>
+              <w:insideV w:val="single" w:sz="8" w:color="D9E5DE"/>
+            </w:tcBorders>
+          </w:tcPr>
+          <w:p>
+            <w:pPr>
+              <w:spacing w:after="0"/>
+            </w:pPr>
+            <w:r/>
+            <w:r>
+              <w:rPr>
+                <w:rFonts w:ascii="Arial" w:hAnsi="Arial"/>
+                <w:b w:val="0"/>
+                <w:color w:val="14231D"/>
+                <w:sz w:val="16"/>
+              </w:rPr>
+              <w:t>chat_id, pengirim_email, teks, waktu</w:t>
+            </w:r>
+          </w:p>
+        </w:tc>
+        <w:tc>
+          <w:tcPr>
+            <w:tcW w:type="dxa" w:w="3402"/>
+            <w:vAlign w:val="center"/>
+            <w:shd w:fill="F7F5EE"/>
+            <w:tcBorders>
+              <w:top w:val="single" w:sz="8" w:color="D9E5DE"/>
+              <w:left w:val="single" w:sz="8" w:color="D9E5DE"/>
+              <w:bottom w:val="single" w:sz="8" w:color="D9E5DE"/>
+              <w:right w:val="single" w:sz="8" w:color="D9E5DE"/>
+              <w:insideH w:val="single" w:sz="8" w:color="D9E5DE"/>
+              <w:insideV w:val="single" w:sz="8" w:color="D9E5DE"/>
+            </w:tcBorders>
+          </w:tcPr>
+          <w:p>
+            <w:pPr>
+              <w:spacing w:after="0"/>
+            </w:pPr>
+            <w:r/>
+            <w:r>
+              <w:rPr>
+                <w:rFonts w:ascii="Arial" w:hAnsi="Arial"/>
+                <w:b w:val="0"/>
+                <w:color w:val="14231D"/>
+                <w:sz w:val="16"/>
+              </w:rPr>
+              <w:t>Menyimpan pesan beserta identitas pengirim</w:t>
+            </w:r>
+          </w:p>
+        </w:tc>
+      </w:tr>
+      <w:tr>
+        <w:tc>
+          <w:tcPr>
+            <w:tcW w:type="dxa" w:w="1701"/>
+            <w:vAlign w:val="center"/>
+            <w:shd w:fill="FFFFFF"/>
+            <w:tcBorders>
+              <w:top w:val="single" w:sz="8" w:color="D9E5DE"/>
+              <w:left w:val="single" w:sz="8" w:color="D9E5DE"/>
+              <w:bottom w:val="single" w:sz="8" w:color="D9E5DE"/>
+              <w:right w:val="single" w:sz="8" w:color="D9E5DE"/>
+              <w:insideH w:val="single" w:sz="8" w:color="D9E5DE"/>
+              <w:insideV w:val="single" w:sz="8" w:color="D9E5DE"/>
+            </w:tcBorders>
+          </w:tcPr>
+          <w:p>
+            <w:pPr>
+              <w:spacing w:after="0"/>
+            </w:pPr>
+            <w:r/>
+            <w:r>
+              <w:rPr>
+                <w:rFonts w:ascii="Arial" w:hAnsi="Arial"/>
+                <w:b w:val="0"/>
+                <w:color w:val="14231D"/>
+                <w:sz w:val="16"/>
+              </w:rPr>
+              <w:t>user_presence</w:t>
+            </w:r>
+          </w:p>
+        </w:tc>
+        <w:tc>
+          <w:tcPr>
+            <w:tcW w:type="dxa" w:w="4535"/>
+            <w:vAlign w:val="center"/>
+            <w:shd w:fill="FFFFFF"/>
+            <w:tcBorders>
+              <w:top w:val="single" w:sz="8" w:color="D9E5DE"/>
+              <w:left w:val="single" w:sz="8" w:color="D9E5DE"/>
+              <w:bottom w:val="single" w:sz="8" w:color="D9E5DE"/>
+              <w:right w:val="single" w:sz="8" w:color="D9E5DE"/>
+              <w:insideH w:val="single" w:sz="8" w:color="D9E5DE"/>
+              <w:insideV w:val="single" w:sz="8" w:color="D9E5DE"/>
+            </w:tcBorders>
+          </w:tcPr>
+          <w:p>
+            <w:pPr>
+              <w:spacing w:after="0"/>
+            </w:pPr>
+            <w:r/>
+            <w:r>
+              <w:rPr>
+                <w:rFonts w:ascii="Arial" w:hAnsi="Arial"/>
+                <w:b w:val="0"/>
+                <w:color w:val="14231D"/>
+                <w:sz w:val="16"/>
+              </w:rPr>
+              <w:t>email, is_online, last_seen</w:t>
+            </w:r>
+          </w:p>
+        </w:tc>
+        <w:tc>
+          <w:tcPr>
+            <w:tcW w:type="dxa" w:w="3402"/>
+            <w:vAlign w:val="center"/>
+            <w:shd w:fill="FFFFFF"/>
+            <w:tcBorders>
+              <w:top w:val="single" w:sz="8" w:color="D9E5DE"/>
+              <w:left w:val="single" w:sz="8" w:color="D9E5DE"/>
+              <w:bottom w:val="single" w:sz="8" w:color="D9E5DE"/>
+              <w:right w:val="single" w:sz="8" w:color="D9E5DE"/>
+              <w:insideH w:val="single" w:sz="8" w:color="D9E5DE"/>
+              <w:insideV w:val="single" w:sz="8" w:color="D9E5DE"/>
+            </w:tcBorders>
+          </w:tcPr>
+          <w:p>
+            <w:pPr>
+              <w:spacing w:after="0"/>
+            </w:pPr>
+            <w:r/>
+            <w:r>
+              <w:rPr>
+                <w:rFonts w:ascii="Arial" w:hAnsi="Arial"/>
+                <w:b w:val="0"/>
+                <w:color w:val="14231D"/>
+                <w:sz w:val="16"/>
+              </w:rPr>
+              <w:t>Menyimpan status kehadiran dan waktu terakhir aktif</w:t>
             </w:r>
           </w:p>
         </w:tc>
@@ -3716,7 +4328,7 @@
                 <w:color w:val="14231D"/>
                 <w:sz w:val="16"/>
               </w:rPr>
-              <w:t>email, title, message, waktu, is_read</w:t>
+              <w:t>notification_key, email, title, message, is_read</w:t>
             </w:r>
           </w:p>
         </w:tc>
@@ -3746,7 +4358,7 @@
                 <w:color w:val="14231D"/>
                 <w:sz w:val="16"/>
               </w:rPr>
-              <w:t>Menyimpan notifikasi pengguna</w:t>
+              <w:t>Menyimpan notifikasi per akun</w:t>
             </w:r>
           </w:p>
         </w:tc>
@@ -4178,7 +4790,7 @@
                 <w:color w:val="14231D"/>
                 <w:sz w:val="16"/>
               </w:rPr>
-              <w:t>Form nama, lokasi, detail, kontak, jenis - kartu foto - tombol Kamera/Galeri - terbitkan</w:t>
+              <w:t>Form nama, lokasi, detail, kontak, jenis - kamera/galeri - detail - hapus khusus pemilik</w:t>
             </w:r>
           </w:p>
         </w:tc>
@@ -4240,7 +4852,7 @@
                 <w:color w:val="14231D"/>
                 <w:sz w:val="16"/>
               </w:rPr>
-              <w:t>Daftar sesi - preview pesan - badge unread - Online/last seen - room chat</w:t>
+              <w:t>Daftar chat anggota - preview pesan - badge unread - online/last seen backend - room chat</w:t>
             </w:r>
           </w:p>
         </w:tc>
@@ -5711,7 +6323,7 @@
     </w:p>
     <w:p>
       <w:r>
-        <w:t>AppDataRepository menjadi penghubung antara UI, API, dan penyimpanan lokal. Saat API tersedia, data disimpan dan dimuat dari MySQL melalui endpoint REST. Saat API tidak tersedia, aplikasi menggunakan cache Hive agar MVP masih dapat dibuka dan diuji. Endpoint admin memakai token sesi untuk memuat seluruh data.</w:t>
+        <w:t>AppDataRepository menjadi penghubung UI dan API; MySQL/MariaDB adalah sumber data bersama untuk seluruh akun. Hive menyimpan salinan lokal perangkat, sementara data akun tidak diambil dari cache lokal ketika API gagal. Aplikasi menarik data baru setiap lima detik dan saat pengguna menyegarkan Jelajah. Laporan dari akun mana pun dikirim ke server dan ditampilkan pada semua akun. Percakapan dibuat per laporan dan pasangan akun; pesan ditambahkan sebagai record baru melalui endpoint khusus, sedangkan snapshot sync tidak pernah menulis ulang pesan. Endpoint admin memakai token sesi untuk memuat seluruh data.</w:t>
       </w:r>
     </w:p>
     <w:tbl>
@@ -5747,11 +6359,23 @@
               <w:br/>
               <w:t>POST /api/index.php?path=auth/admin-login</w:t>
               <w:br/>
+              <w:t>POST /api/index.php?path=presence</w:t>
+              <w:br/>
+              <w:t>POST /api/index.php?path=chats/start</w:t>
+              <w:br/>
+              <w:t>POST /api/index.php?path=messages/send</w:t>
+              <w:br/>
+              <w:t>POST /api/index.php?path=chats/read</w:t>
+              <w:br/>
+              <w:t>POST /api/index.php?path=notifications/read-all</w:t>
+              <w:br/>
               <w:t>GET  /api/index.php?path=sync&amp;email=...</w:t>
               <w:br/>
               <w:t>GET  /api/index.php?path=admin/sync</w:t>
               <w:br/>
               <w:t>POST /api/index.php?path=sync</w:t>
+              <w:br/>
+              <w:t>DELETE /api/index.php?path=reports&amp;email=...&amp;id=...</w:t>
             </w:r>
           </w:p>
         </w:tc>
@@ -5776,7 +6400,7 @@
         <w:spacing w:after="40"/>
       </w:pPr>
       <w:r>
-        <w:t>Login mahasiswa dengan pembatasan domain email resmi kampus.</w:t>
+        <w:t>Login mahasiswa membatasi domain email kampus dan menolak email dengan nama/NIM berbeda dari catatan database.</w:t>
       </w:r>
     </w:p>
     <w:p>
@@ -5812,7 +6436,7 @@
         <w:spacing w:after="40"/>
       </w:pPr>
       <w:r>
-        <w:t>Chat klaim dengan status Online atau Terakhir dilihat.</w:t>
+        <w:t>Chat klaim per laporan dan pasangan akun dengan pesan append-only pada database bersama.</w:t>
       </w:r>
     </w:p>
     <w:p>
@@ -5821,7 +6445,7 @@
         <w:spacing w:after="40"/>
       </w:pPr>
       <w:r>
-        <w:t>Popup notifikasi pesan dan badge jumlah chat/pemberitahuan.</w:t>
+        <w:t>Popup pesan masuk, notifikasi per penerima, serta badge jumlah chat/pemberitahuan.</w:t>
       </w:r>
     </w:p>
     <w:p>
@@ -5830,7 +6454,34 @@
         <w:spacing w:after="40"/>
       </w:pPr>
       <w:r>
-        <w:t>Database MySQL/MariaDB dan fallback Hive lokal.</w:t>
+        <w:t>Status online dan last seen dibaca dari tabel presence backend.</w:t>
+      </w:r>
+    </w:p>
+    <w:p>
+      <w:pPr>
+        <w:pStyle w:val="ListBullet"/>
+        <w:spacing w:after="40"/>
+      </w:pPr>
+      <w:r>
+        <w:t>Penghapusan laporan dibatasi pada pemilik dan berlaku untuk semua akun.</w:t>
+      </w:r>
+    </w:p>
+    <w:p>
+      <w:pPr>
+        <w:pStyle w:val="ListBullet"/>
+        <w:spacing w:after="40"/>
+      </w:pPr>
+      <w:r>
+        <w:t>MySQL/MariaDB menjadi sumber data bersama; Hive menyimpan cache perangkat tanpa fallback silang akun.</w:t>
+      </w:r>
+    </w:p>
+    <w:p>
+      <w:pPr>
+        <w:pStyle w:val="ListBullet"/>
+        <w:spacing w:after="40"/>
+      </w:pPr>
+      <w:r>
+        <w:t>Sinkronisasi berkala lima detik memperbarui laporan, chat, dan notifikasi.</w:t>
       </w:r>
     </w:p>
     <w:p>
@@ -6340,6 +6991,374 @@
                 <w:color w:val="14231D"/>
                 <w:sz w:val="16"/>
               </w:rPr>
+              <w:t>Chat dua akun</w:t>
+            </w:r>
+          </w:p>
+        </w:tc>
+        <w:tc>
+          <w:tcPr>
+            <w:tcW w:type="dxa" w:w="1701"/>
+            <w:vAlign w:val="center"/>
+            <w:shd w:fill="F7F5EE"/>
+            <w:tcBorders>
+              <w:top w:val="single" w:sz="8" w:color="D9E5DE"/>
+              <w:left w:val="single" w:sz="8" w:color="D9E5DE"/>
+              <w:bottom w:val="single" w:sz="8" w:color="D9E5DE"/>
+              <w:right w:val="single" w:sz="8" w:color="D9E5DE"/>
+              <w:insideH w:val="single" w:sz="8" w:color="D9E5DE"/>
+              <w:insideV w:val="single" w:sz="8" w:color="D9E5DE"/>
+            </w:tcBorders>
+          </w:tcPr>
+          <w:p>
+            <w:pPr>
+              <w:spacing w:after="0"/>
+            </w:pPr>
+            <w:r/>
+            <w:r>
+              <w:rPr>
+                <w:rFonts w:ascii="Arial" w:hAnsi="Arial"/>
+                <w:b w:val="0"/>
+                <w:color w:val="14231D"/>
+                <w:sz w:val="16"/>
+              </w:rPr>
+              <w:t>LULUS</w:t>
+            </w:r>
+          </w:p>
+        </w:tc>
+        <w:tc>
+          <w:tcPr>
+            <w:tcW w:type="dxa" w:w="5102"/>
+            <w:vAlign w:val="center"/>
+            <w:shd w:fill="F7F5EE"/>
+            <w:tcBorders>
+              <w:top w:val="single" w:sz="8" w:color="D9E5DE"/>
+              <w:left w:val="single" w:sz="8" w:color="D9E5DE"/>
+              <w:bottom w:val="single" w:sz="8" w:color="D9E5DE"/>
+              <w:right w:val="single" w:sz="8" w:color="D9E5DE"/>
+              <w:insideH w:val="single" w:sz="8" w:color="D9E5DE"/>
+              <w:insideV w:val="single" w:sz="8" w:color="D9E5DE"/>
+            </w:tcBorders>
+          </w:tcPr>
+          <w:p>
+            <w:pPr>
+              <w:spacing w:after="0"/>
+            </w:pPr>
+            <w:r/>
+            <w:r>
+              <w:rPr>
+                <w:rFonts w:ascii="Arial" w:hAnsi="Arial"/>
+                <w:b w:val="0"/>
+                <w:color w:val="14231D"/>
+                <w:sz w:val="16"/>
+              </w:rPr>
+              <w:t>Pesan dari akun pengirim terlihat pada akun penerima; unread dan notifikasi terbuat</w:t>
+            </w:r>
+          </w:p>
+        </w:tc>
+      </w:tr>
+      <w:tr>
+        <w:tc>
+          <w:tcPr>
+            <w:tcW w:type="dxa" w:w="2835"/>
+            <w:vAlign w:val="center"/>
+            <w:shd w:fill="FFFFFF"/>
+            <w:tcBorders>
+              <w:top w:val="single" w:sz="8" w:color="D9E5DE"/>
+              <w:left w:val="single" w:sz="8" w:color="D9E5DE"/>
+              <w:bottom w:val="single" w:sz="8" w:color="D9E5DE"/>
+              <w:right w:val="single" w:sz="8" w:color="D9E5DE"/>
+              <w:insideH w:val="single" w:sz="8" w:color="D9E5DE"/>
+              <w:insideV w:val="single" w:sz="8" w:color="D9E5DE"/>
+            </w:tcBorders>
+          </w:tcPr>
+          <w:p>
+            <w:pPr>
+              <w:spacing w:after="0"/>
+            </w:pPr>
+            <w:r/>
+            <w:r>
+              <w:rPr>
+                <w:rFonts w:ascii="Arial" w:hAnsi="Arial"/>
+                <w:b w:val="0"/>
+                <w:color w:val="14231D"/>
+                <w:sz w:val="16"/>
+              </w:rPr>
+              <w:t>Proteksi pesan</w:t>
+            </w:r>
+          </w:p>
+        </w:tc>
+        <w:tc>
+          <w:tcPr>
+            <w:tcW w:type="dxa" w:w="1701"/>
+            <w:vAlign w:val="center"/>
+            <w:shd w:fill="FFFFFF"/>
+            <w:tcBorders>
+              <w:top w:val="single" w:sz="8" w:color="D9E5DE"/>
+              <w:left w:val="single" w:sz="8" w:color="D9E5DE"/>
+              <w:bottom w:val="single" w:sz="8" w:color="D9E5DE"/>
+              <w:right w:val="single" w:sz="8" w:color="D9E5DE"/>
+              <w:insideH w:val="single" w:sz="8" w:color="D9E5DE"/>
+              <w:insideV w:val="single" w:sz="8" w:color="D9E5DE"/>
+            </w:tcBorders>
+          </w:tcPr>
+          <w:p>
+            <w:pPr>
+              <w:spacing w:after="0"/>
+            </w:pPr>
+            <w:r/>
+            <w:r>
+              <w:rPr>
+                <w:rFonts w:ascii="Arial" w:hAnsi="Arial"/>
+                <w:b w:val="0"/>
+                <w:color w:val="14231D"/>
+                <w:sz w:val="16"/>
+              </w:rPr>
+              <w:t>LULUS</w:t>
+            </w:r>
+          </w:p>
+        </w:tc>
+        <w:tc>
+          <w:tcPr>
+            <w:tcW w:type="dxa" w:w="5102"/>
+            <w:vAlign w:val="center"/>
+            <w:shd w:fill="FFFFFF"/>
+            <w:tcBorders>
+              <w:top w:val="single" w:sz="8" w:color="D9E5DE"/>
+              <w:left w:val="single" w:sz="8" w:color="D9E5DE"/>
+              <w:bottom w:val="single" w:sz="8" w:color="D9E5DE"/>
+              <w:right w:val="single" w:sz="8" w:color="D9E5DE"/>
+              <w:insideH w:val="single" w:sz="8" w:color="D9E5DE"/>
+              <w:insideV w:val="single" w:sz="8" w:color="D9E5DE"/>
+            </w:tcBorders>
+          </w:tcPr>
+          <w:p>
+            <w:pPr>
+              <w:spacing w:after="0"/>
+            </w:pPr>
+            <w:r/>
+            <w:r>
+              <w:rPr>
+                <w:rFonts w:ascii="Arial" w:hAnsi="Arial"/>
+                <w:b w:val="0"/>
+                <w:color w:val="14231D"/>
+                <w:sz w:val="16"/>
+              </w:rPr>
+              <w:t>Sinkronisasi snapshot lama tidak menghapus pesan tersimpan</w:t>
+            </w:r>
+          </w:p>
+        </w:tc>
+      </w:tr>
+      <w:tr>
+        <w:tc>
+          <w:tcPr>
+            <w:tcW w:type="dxa" w:w="2835"/>
+            <w:vAlign w:val="center"/>
+            <w:shd w:fill="F7F5EE"/>
+            <w:tcBorders>
+              <w:top w:val="single" w:sz="8" w:color="D9E5DE"/>
+              <w:left w:val="single" w:sz="8" w:color="D9E5DE"/>
+              <w:bottom w:val="single" w:sz="8" w:color="D9E5DE"/>
+              <w:right w:val="single" w:sz="8" w:color="D9E5DE"/>
+              <w:insideH w:val="single" w:sz="8" w:color="D9E5DE"/>
+              <w:insideV w:val="single" w:sz="8" w:color="D9E5DE"/>
+            </w:tcBorders>
+          </w:tcPr>
+          <w:p>
+            <w:pPr>
+              <w:spacing w:after="0"/>
+            </w:pPr>
+            <w:r/>
+            <w:r>
+              <w:rPr>
+                <w:rFonts w:ascii="Arial" w:hAnsi="Arial"/>
+                <w:b w:val="0"/>
+                <w:color w:val="14231D"/>
+                <w:sz w:val="16"/>
+              </w:rPr>
+              <w:t>Tandai sudah dibaca</w:t>
+            </w:r>
+          </w:p>
+        </w:tc>
+        <w:tc>
+          <w:tcPr>
+            <w:tcW w:type="dxa" w:w="1701"/>
+            <w:vAlign w:val="center"/>
+            <w:shd w:fill="F7F5EE"/>
+            <w:tcBorders>
+              <w:top w:val="single" w:sz="8" w:color="D9E5DE"/>
+              <w:left w:val="single" w:sz="8" w:color="D9E5DE"/>
+              <w:bottom w:val="single" w:sz="8" w:color="D9E5DE"/>
+              <w:right w:val="single" w:sz="8" w:color="D9E5DE"/>
+              <w:insideH w:val="single" w:sz="8" w:color="D9E5DE"/>
+              <w:insideV w:val="single" w:sz="8" w:color="D9E5DE"/>
+            </w:tcBorders>
+          </w:tcPr>
+          <w:p>
+            <w:pPr>
+              <w:spacing w:after="0"/>
+            </w:pPr>
+            <w:r/>
+            <w:r>
+              <w:rPr>
+                <w:rFonts w:ascii="Arial" w:hAnsi="Arial"/>
+                <w:b w:val="0"/>
+                <w:color w:val="14231D"/>
+                <w:sz w:val="16"/>
+              </w:rPr>
+              <w:t>LULUS</w:t>
+            </w:r>
+          </w:p>
+        </w:tc>
+        <w:tc>
+          <w:tcPr>
+            <w:tcW w:type="dxa" w:w="5102"/>
+            <w:vAlign w:val="center"/>
+            <w:shd w:fill="F7F5EE"/>
+            <w:tcBorders>
+              <w:top w:val="single" w:sz="8" w:color="D9E5DE"/>
+              <w:left w:val="single" w:sz="8" w:color="D9E5DE"/>
+              <w:bottom w:val="single" w:sz="8" w:color="D9E5DE"/>
+              <w:right w:val="single" w:sz="8" w:color="D9E5DE"/>
+              <w:insideH w:val="single" w:sz="8" w:color="D9E5DE"/>
+              <w:insideV w:val="single" w:sz="8" w:color="D9E5DE"/>
+            </w:tcBorders>
+          </w:tcPr>
+          <w:p>
+            <w:pPr>
+              <w:spacing w:after="0"/>
+            </w:pPr>
+            <w:r/>
+            <w:r>
+              <w:rPr>
+                <w:rFonts w:ascii="Arial" w:hAnsi="Arial"/>
+                <w:b w:val="0"/>
+                <w:color w:val="14231D"/>
+                <w:sz w:val="16"/>
+              </w:rPr>
+              <w:t>Unread count kembali menjadi nol dan notifikasi chat ditandai dibaca</w:t>
+            </w:r>
+          </w:p>
+        </w:tc>
+      </w:tr>
+      <w:tr>
+        <w:tc>
+          <w:tcPr>
+            <w:tcW w:type="dxa" w:w="2835"/>
+            <w:vAlign w:val="center"/>
+            <w:shd w:fill="FFFFFF"/>
+            <w:tcBorders>
+              <w:top w:val="single" w:sz="8" w:color="D9E5DE"/>
+              <w:left w:val="single" w:sz="8" w:color="D9E5DE"/>
+              <w:bottom w:val="single" w:sz="8" w:color="D9E5DE"/>
+              <w:right w:val="single" w:sz="8" w:color="D9E5DE"/>
+              <w:insideH w:val="single" w:sz="8" w:color="D9E5DE"/>
+              <w:insideV w:val="single" w:sz="8" w:color="D9E5DE"/>
+            </w:tcBorders>
+          </w:tcPr>
+          <w:p>
+            <w:pPr>
+              <w:spacing w:after="0"/>
+            </w:pPr>
+            <w:r/>
+            <w:r>
+              <w:rPr>
+                <w:rFonts w:ascii="Arial" w:hAnsi="Arial"/>
+                <w:b w:val="0"/>
+                <w:color w:val="14231D"/>
+                <w:sz w:val="16"/>
+              </w:rPr>
+              <w:t>Presence</w:t>
+            </w:r>
+          </w:p>
+        </w:tc>
+        <w:tc>
+          <w:tcPr>
+            <w:tcW w:type="dxa" w:w="1701"/>
+            <w:vAlign w:val="center"/>
+            <w:shd w:fill="FFFFFF"/>
+            <w:tcBorders>
+              <w:top w:val="single" w:sz="8" w:color="D9E5DE"/>
+              <w:left w:val="single" w:sz="8" w:color="D9E5DE"/>
+              <w:bottom w:val="single" w:sz="8" w:color="D9E5DE"/>
+              <w:right w:val="single" w:sz="8" w:color="D9E5DE"/>
+              <w:insideH w:val="single" w:sz="8" w:color="D9E5DE"/>
+              <w:insideV w:val="single" w:sz="8" w:color="D9E5DE"/>
+            </w:tcBorders>
+          </w:tcPr>
+          <w:p>
+            <w:pPr>
+              <w:spacing w:after="0"/>
+            </w:pPr>
+            <w:r/>
+            <w:r>
+              <w:rPr>
+                <w:rFonts w:ascii="Arial" w:hAnsi="Arial"/>
+                <w:b w:val="0"/>
+                <w:color w:val="14231D"/>
+                <w:sz w:val="16"/>
+              </w:rPr>
+              <w:t>LULUS</w:t>
+            </w:r>
+          </w:p>
+        </w:tc>
+        <w:tc>
+          <w:tcPr>
+            <w:tcW w:type="dxa" w:w="5102"/>
+            <w:vAlign w:val="center"/>
+            <w:shd w:fill="FFFFFF"/>
+            <w:tcBorders>
+              <w:top w:val="single" w:sz="8" w:color="D9E5DE"/>
+              <w:left w:val="single" w:sz="8" w:color="D9E5DE"/>
+              <w:bottom w:val="single" w:sz="8" w:color="D9E5DE"/>
+              <w:right w:val="single" w:sz="8" w:color="D9E5DE"/>
+              <w:insideH w:val="single" w:sz="8" w:color="D9E5DE"/>
+              <w:insideV w:val="single" w:sz="8" w:color="D9E5DE"/>
+            </w:tcBorders>
+          </w:tcPr>
+          <w:p>
+            <w:pPr>
+              <w:spacing w:after="0"/>
+            </w:pPr>
+            <w:r/>
+            <w:r>
+              <w:rPr>
+                <w:rFonts w:ascii="Arial" w:hAnsi="Arial"/>
+                <w:b w:val="0"/>
+                <w:color w:val="14231D"/>
+                <w:sz w:val="16"/>
+              </w:rPr>
+              <w:t>Heartbeat UTC menunjukkan status Online dan waktu last seen</w:t>
+            </w:r>
+          </w:p>
+        </w:tc>
+      </w:tr>
+      <w:tr>
+        <w:tc>
+          <w:tcPr>
+            <w:tcW w:type="dxa" w:w="2835"/>
+            <w:vAlign w:val="center"/>
+            <w:shd w:fill="F7F5EE"/>
+            <w:tcBorders>
+              <w:top w:val="single" w:sz="8" w:color="D9E5DE"/>
+              <w:left w:val="single" w:sz="8" w:color="D9E5DE"/>
+              <w:bottom w:val="single" w:sz="8" w:color="D9E5DE"/>
+              <w:right w:val="single" w:sz="8" w:color="D9E5DE"/>
+              <w:insideH w:val="single" w:sz="8" w:color="D9E5DE"/>
+              <w:insideV w:val="single" w:sz="8" w:color="D9E5DE"/>
+            </w:tcBorders>
+          </w:tcPr>
+          <w:p>
+            <w:pPr>
+              <w:spacing w:after="0"/>
+            </w:pPr>
+            <w:r/>
+            <w:r>
+              <w:rPr>
+                <w:rFonts w:ascii="Arial" w:hAnsi="Arial"/>
+                <w:b w:val="0"/>
+                <w:color w:val="14231D"/>
+                <w:sz w:val="16"/>
+              </w:rPr>
               <w:t>API admin sync</w:t>
             </w:r>
           </w:p>
@@ -6432,7 +7451,7 @@
                 <w:color w:val="14231D"/>
                 <w:sz w:val="16"/>
               </w:rPr>
-              <w:t>Flutter build web</w:t>
+              <w:t>Kunci identitas email</w:t>
             </w:r>
           </w:p>
         </w:tc>
@@ -6492,7 +7511,7 @@
                 <w:color w:val="14231D"/>
                 <w:sz w:val="16"/>
               </w:rPr>
-              <w:t>Build Web berhasil dikompilasi</w:t>
+              <w:t>Identitas berbeda ditolak HTTP 409; identitas terdaftar diterima</w:t>
             </w:r>
           </w:p>
         </w:tc>
@@ -6524,7 +7543,7 @@
                 <w:color w:val="14231D"/>
                 <w:sz w:val="16"/>
               </w:rPr>
-              <w:t>Git</w:t>
+              <w:t>Batas penghapusan laporan</w:t>
             </w:r>
           </w:p>
         </w:tc>
@@ -6563,6 +7582,282 @@
             <w:tcW w:type="dxa" w:w="5102"/>
             <w:vAlign w:val="center"/>
             <w:shd w:fill="F7F5EE"/>
+            <w:tcBorders>
+              <w:top w:val="single" w:sz="8" w:color="D9E5DE"/>
+              <w:left w:val="single" w:sz="8" w:color="D9E5DE"/>
+              <w:bottom w:val="single" w:sz="8" w:color="D9E5DE"/>
+              <w:right w:val="single" w:sz="8" w:color="D9E5DE"/>
+              <w:insideH w:val="single" w:sz="8" w:color="D9E5DE"/>
+              <w:insideV w:val="single" w:sz="8" w:color="D9E5DE"/>
+            </w:tcBorders>
+          </w:tcPr>
+          <w:p>
+            <w:pPr>
+              <w:spacing w:after="0"/>
+            </w:pPr>
+            <w:r/>
+            <w:r>
+              <w:rPr>
+                <w:rFonts w:ascii="Arial" w:hAnsi="Arial"/>
+                <w:b w:val="0"/>
+                <w:color w:val="14231D"/>
+                <w:sz w:val="16"/>
+              </w:rPr>
+              <w:t>Akun selain pemilik ditolak HTTP 403</w:t>
+            </w:r>
+          </w:p>
+        </w:tc>
+      </w:tr>
+      <w:tr>
+        <w:tc>
+          <w:tcPr>
+            <w:tcW w:type="dxa" w:w="2835"/>
+            <w:vAlign w:val="center"/>
+            <w:shd w:fill="FFFFFF"/>
+            <w:tcBorders>
+              <w:top w:val="single" w:sz="8" w:color="D9E5DE"/>
+              <w:left w:val="single" w:sz="8" w:color="D9E5DE"/>
+              <w:bottom w:val="single" w:sz="8" w:color="D9E5DE"/>
+              <w:right w:val="single" w:sz="8" w:color="D9E5DE"/>
+              <w:insideH w:val="single" w:sz="8" w:color="D9E5DE"/>
+              <w:insideV w:val="single" w:sz="8" w:color="D9E5DE"/>
+            </w:tcBorders>
+          </w:tcPr>
+          <w:p>
+            <w:pPr>
+              <w:spacing w:after="0"/>
+            </w:pPr>
+            <w:r/>
+            <w:r>
+              <w:rPr>
+                <w:rFonts w:ascii="Arial" w:hAnsi="Arial"/>
+                <w:b w:val="0"/>
+                <w:color w:val="14231D"/>
+                <w:sz w:val="16"/>
+              </w:rPr>
+              <w:t>API sync pengguna</w:t>
+            </w:r>
+          </w:p>
+        </w:tc>
+        <w:tc>
+          <w:tcPr>
+            <w:tcW w:type="dxa" w:w="1701"/>
+            <w:vAlign w:val="center"/>
+            <w:shd w:fill="FFFFFF"/>
+            <w:tcBorders>
+              <w:top w:val="single" w:sz="8" w:color="D9E5DE"/>
+              <w:left w:val="single" w:sz="8" w:color="D9E5DE"/>
+              <w:bottom w:val="single" w:sz="8" w:color="D9E5DE"/>
+              <w:right w:val="single" w:sz="8" w:color="D9E5DE"/>
+              <w:insideH w:val="single" w:sz="8" w:color="D9E5DE"/>
+              <w:insideV w:val="single" w:sz="8" w:color="D9E5DE"/>
+            </w:tcBorders>
+          </w:tcPr>
+          <w:p>
+            <w:pPr>
+              <w:spacing w:after="0"/>
+            </w:pPr>
+            <w:r/>
+            <w:r>
+              <w:rPr>
+                <w:rFonts w:ascii="Arial" w:hAnsi="Arial"/>
+                <w:b w:val="0"/>
+                <w:color w:val="14231D"/>
+                <w:sz w:val="16"/>
+              </w:rPr>
+              <w:t>LULUS</w:t>
+            </w:r>
+          </w:p>
+        </w:tc>
+        <w:tc>
+          <w:tcPr>
+            <w:tcW w:type="dxa" w:w="5102"/>
+            <w:vAlign w:val="center"/>
+            <w:shd w:fill="FFFFFF"/>
+            <w:tcBorders>
+              <w:top w:val="single" w:sz="8" w:color="D9E5DE"/>
+              <w:left w:val="single" w:sz="8" w:color="D9E5DE"/>
+              <w:bottom w:val="single" w:sz="8" w:color="D9E5DE"/>
+              <w:right w:val="single" w:sz="8" w:color="D9E5DE"/>
+              <w:insideH w:val="single" w:sz="8" w:color="D9E5DE"/>
+              <w:insideV w:val="single" w:sz="8" w:color="D9E5DE"/>
+            </w:tcBorders>
+          </w:tcPr>
+          <w:p>
+            <w:pPr>
+              <w:spacing w:after="0"/>
+            </w:pPr>
+            <w:r/>
+            <w:r>
+              <w:rPr>
+                <w:rFonts w:ascii="Arial" w:hAnsi="Arial"/>
+                <w:b w:val="0"/>
+                <w:color w:val="14231D"/>
+                <w:sz w:val="16"/>
+              </w:rPr>
+              <w:t>Database aktif; pemeriksaan mengembalikan 3 laporan, 1 chat, dan 2 notifikasi</w:t>
+            </w:r>
+          </w:p>
+        </w:tc>
+      </w:tr>
+      <w:tr>
+        <w:tc>
+          <w:tcPr>
+            <w:tcW w:type="dxa" w:w="2835"/>
+            <w:vAlign w:val="center"/>
+            <w:shd w:fill="F7F5EE"/>
+            <w:tcBorders>
+              <w:top w:val="single" w:sz="8" w:color="D9E5DE"/>
+              <w:left w:val="single" w:sz="8" w:color="D9E5DE"/>
+              <w:bottom w:val="single" w:sz="8" w:color="D9E5DE"/>
+              <w:right w:val="single" w:sz="8" w:color="D9E5DE"/>
+              <w:insideH w:val="single" w:sz="8" w:color="D9E5DE"/>
+              <w:insideV w:val="single" w:sz="8" w:color="D9E5DE"/>
+            </w:tcBorders>
+          </w:tcPr>
+          <w:p>
+            <w:pPr>
+              <w:spacing w:after="0"/>
+            </w:pPr>
+            <w:r/>
+            <w:r>
+              <w:rPr>
+                <w:rFonts w:ascii="Arial" w:hAnsi="Arial"/>
+                <w:b w:val="0"/>
+                <w:color w:val="14231D"/>
+                <w:sz w:val="16"/>
+              </w:rPr>
+              <w:t>Flutter build web</w:t>
+            </w:r>
+          </w:p>
+        </w:tc>
+        <w:tc>
+          <w:tcPr>
+            <w:tcW w:type="dxa" w:w="1701"/>
+            <w:vAlign w:val="center"/>
+            <w:shd w:fill="F7F5EE"/>
+            <w:tcBorders>
+              <w:top w:val="single" w:sz="8" w:color="D9E5DE"/>
+              <w:left w:val="single" w:sz="8" w:color="D9E5DE"/>
+              <w:bottom w:val="single" w:sz="8" w:color="D9E5DE"/>
+              <w:right w:val="single" w:sz="8" w:color="D9E5DE"/>
+              <w:insideH w:val="single" w:sz="8" w:color="D9E5DE"/>
+              <w:insideV w:val="single" w:sz="8" w:color="D9E5DE"/>
+            </w:tcBorders>
+          </w:tcPr>
+          <w:p>
+            <w:pPr>
+              <w:spacing w:after="0"/>
+            </w:pPr>
+            <w:r/>
+            <w:r>
+              <w:rPr>
+                <w:rFonts w:ascii="Arial" w:hAnsi="Arial"/>
+                <w:b w:val="0"/>
+                <w:color w:val="14231D"/>
+                <w:sz w:val="16"/>
+              </w:rPr>
+              <w:t>LULUS</w:t>
+            </w:r>
+          </w:p>
+        </w:tc>
+        <w:tc>
+          <w:tcPr>
+            <w:tcW w:type="dxa" w:w="5102"/>
+            <w:vAlign w:val="center"/>
+            <w:shd w:fill="F7F5EE"/>
+            <w:tcBorders>
+              <w:top w:val="single" w:sz="8" w:color="D9E5DE"/>
+              <w:left w:val="single" w:sz="8" w:color="D9E5DE"/>
+              <w:bottom w:val="single" w:sz="8" w:color="D9E5DE"/>
+              <w:right w:val="single" w:sz="8" w:color="D9E5DE"/>
+              <w:insideH w:val="single" w:sz="8" w:color="D9E5DE"/>
+              <w:insideV w:val="single" w:sz="8" w:color="D9E5DE"/>
+            </w:tcBorders>
+          </w:tcPr>
+          <w:p>
+            <w:pPr>
+              <w:spacing w:after="0"/>
+            </w:pPr>
+            <w:r/>
+            <w:r>
+              <w:rPr>
+                <w:rFonts w:ascii="Arial" w:hAnsi="Arial"/>
+                <w:b w:val="0"/>
+                <w:color w:val="14231D"/>
+                <w:sz w:val="16"/>
+              </w:rPr>
+              <w:t>Build Web berhasil dikompilasi</w:t>
+            </w:r>
+          </w:p>
+        </w:tc>
+      </w:tr>
+      <w:tr>
+        <w:tc>
+          <w:tcPr>
+            <w:tcW w:type="dxa" w:w="2835"/>
+            <w:vAlign w:val="center"/>
+            <w:shd w:fill="FFFFFF"/>
+            <w:tcBorders>
+              <w:top w:val="single" w:sz="8" w:color="D9E5DE"/>
+              <w:left w:val="single" w:sz="8" w:color="D9E5DE"/>
+              <w:bottom w:val="single" w:sz="8" w:color="D9E5DE"/>
+              <w:right w:val="single" w:sz="8" w:color="D9E5DE"/>
+              <w:insideH w:val="single" w:sz="8" w:color="D9E5DE"/>
+              <w:insideV w:val="single" w:sz="8" w:color="D9E5DE"/>
+            </w:tcBorders>
+          </w:tcPr>
+          <w:p>
+            <w:pPr>
+              <w:spacing w:after="0"/>
+            </w:pPr>
+            <w:r/>
+            <w:r>
+              <w:rPr>
+                <w:rFonts w:ascii="Arial" w:hAnsi="Arial"/>
+                <w:b w:val="0"/>
+                <w:color w:val="14231D"/>
+                <w:sz w:val="16"/>
+              </w:rPr>
+              <w:t>Git</w:t>
+            </w:r>
+          </w:p>
+        </w:tc>
+        <w:tc>
+          <w:tcPr>
+            <w:tcW w:type="dxa" w:w="1701"/>
+            <w:vAlign w:val="center"/>
+            <w:shd w:fill="FFFFFF"/>
+            <w:tcBorders>
+              <w:top w:val="single" w:sz="8" w:color="D9E5DE"/>
+              <w:left w:val="single" w:sz="8" w:color="D9E5DE"/>
+              <w:bottom w:val="single" w:sz="8" w:color="D9E5DE"/>
+              <w:right w:val="single" w:sz="8" w:color="D9E5DE"/>
+              <w:insideH w:val="single" w:sz="8" w:color="D9E5DE"/>
+              <w:insideV w:val="single" w:sz="8" w:color="D9E5DE"/>
+            </w:tcBorders>
+          </w:tcPr>
+          <w:p>
+            <w:pPr>
+              <w:spacing w:after="0"/>
+            </w:pPr>
+            <w:r/>
+            <w:r>
+              <w:rPr>
+                <w:rFonts w:ascii="Arial" w:hAnsi="Arial"/>
+                <w:b w:val="0"/>
+                <w:color w:val="14231D"/>
+                <w:sz w:val="16"/>
+              </w:rPr>
+              <w:t>LULUS</w:t>
+            </w:r>
+          </w:p>
+        </w:tc>
+        <w:tc>
+          <w:tcPr>
+            <w:tcW w:type="dxa" w:w="5102"/>
+            <w:vAlign w:val="center"/>
+            <w:shd w:fill="FFFFFF"/>
             <w:tcBorders>
               <w:top w:val="single" w:sz="8" w:color="D9E5DE"/>
               <w:left w:val="single" w:sz="8" w:color="D9E5DE"/>
@@ -6692,7 +7987,7 @@
         <w:rPr>
           <w:rFonts w:ascii="Consolas" w:hAnsi="Consolas"/>
         </w:rPr>
-        <w:t>Commit utama implementasi admin: 732d5fa</w:t>
+        <w:t>Versi kode terbaru tersedia pada branch main repository GitHub.</w:t>
       </w:r>
     </w:p>
     <w:p>
@@ -7640,7 +8935,7 @@
                 <w:color w:val="14231D"/>
                 <w:sz w:val="14"/>
               </w:rPr>
-              <w:t>Buka phpMyAdmin database lost_and_found_campus dan screenshot tabel users, reports, chats, messages, notifications.</w:t>
+              <w:t>Buka phpMyAdmin database lost_and_found_campus dan screenshot tabel users, reports, chats, chat_members, messages, user_presence, notifications.</w:t>
             </w:r>
           </w:p>
         </w:tc>
@@ -7995,12 +9290,12 @@
     </w:p>
     <w:p>
       <w:r>
-        <w:t>Tahap 2 telah menghasilkan rancangan alur aplikasi, use case, struktur navigasi, model data, wireframe, dan purwarupa antarmuka. Tahap 3 telah mengimplementasikan rancangan tersebut menjadi MVP Flutter yang dapat dijalankan pada target platform yang tersedia, terhubung ke backend REST API dan database MySQL/MariaDB, serta memiliki validasi masukan dan pengujian.</w:t>
+        <w:t>Tahap 2 telah menghasilkan rancangan alur aplikasi, use case, struktur navigasi, model data multiakun, wireframe, dan purwarupa antarmuka. Tahap 3 telah mengimplementasikan rancangan tersebut menjadi MVP Flutter yang dapat dijalankan pada target platform yang tersedia, terhubung ke backend REST API dan database MySQL/MariaDB, serta memiliki validasi masukan dan pengujian.</w:t>
       </w:r>
     </w:p>
     <w:p>
       <w:r>
-        <w:t>Dengan adanya dashboard mahasiswa dan dashboard admin, aplikasi telah memiliki pemisahan akses sesuai peran pengguna. Fitur utama Lost &amp; Found—laporan, pencarian, chat, notifikasi, upload foto, penyimpanan data, dan monitoring admin—telah dapat digunakan sebagai dasar pengembangan tahap berikutnya.</w:t>
+        <w:t>Dengan adanya dashboard mahasiswa dan dashboard admin, aplikasi telah memiliki pemisahan akses sesuai peran. Identitas mahasiswa dikunci pada email, NIM, dan nama terdaftar. Laporan tersedia lintas akun dari database bersama; chat, pesan, notifikasi, badge, serta status online/last seen dikelola backend. Pemilik dapat menghapus laporannya dan penghapusan berlaku bagi semua akun. Fitur ini melengkapi pencarian, upload foto, penyimpanan data, dan monitoring admin sebagai MVP.</w:t>
       </w:r>
     </w:p>
     <w:p>
@@ -8009,6 +9304,11 @@
       </w:pPr>
       <w:r>
         <w:t>Pengembangan Lanjutan</w:t>
+      </w:r>
+    </w:p>
+    <w:p>
+      <w:r>
+        <w:t>Catatan batas implementasi: pemeriksaan nama dan NIM mencegah satu alamat email dipakai dengan identitas berbeda, tetapi belum memverifikasi bahwa pengguna benar-benar memiliki kotak email tersebut. Sinkronisasi chat menggunakan polling berkala lima detik, sehingga pembaruan tidak instan. Backend Laragon saat ini ditujukan untuk pengembangan dan demonstrasi; sebelum dipublikasikan perlu autentikasi pengguna yang terverifikasi serta pembatasan akses endpoint berdasarkan sesi/token.</w:t>
       </w:r>
     </w:p>
     <w:p>
@@ -8035,7 +9335,7 @@
         <w:spacing w:after="40"/>
       </w:pPr>
       <w:r>
-        <w:t>Menambahkan autentikasi token yang lebih kuat, role permission, dan audit log.</w:t>
+        <w:t>Menambahkan autentikasi mahasiswa dengan OTP atau penyedia identitas resmi; login saat ini mengunci identitas tetapi belum membuktikan kepemilikan email.</w:t>
       </w:r>
     </w:p>
     <w:p>
@@ -8044,7 +9344,16 @@
         <w:spacing w:after="40"/>
       </w:pPr>
       <w:r>
-        <w:t>Menambahkan notifikasi push dan deployment backend ke server publik.</w:t>
+        <w:t>Menerapkan WebSocket atau push notification untuk pengiriman instan; sinkronisasi saat ini berjalan berkala setiap lima detik.</w:t>
+      </w:r>
+    </w:p>
+    <w:p>
+      <w:pPr>
+        <w:pStyle w:val="ListBullet"/>
+        <w:spacing w:after="40"/>
+      </w:pPr>
+      <w:r>
+        <w:t>Memperkuat izin server untuk endpoint sinkronisasi dan status kehadiran sebelum deployment publik.</w:t>
       </w:r>
     </w:p>
     <w:sectPr>

</xml_diff>

<commit_message>
Finalize integration tests and project documentation
</commit_message>
<xml_diff>
--- a/docs/Laporan_Tahap_2_dan_3_TEMU_UIN_Malang.docx
+++ b/docs/Laporan_Tahap_2_dan_3_TEMU_UIN_Malang.docx
@@ -687,7 +687,7 @@
         <w:spacing w:after="40"/>
       </w:pPr>
       <w:r>
-        <w:t>Menyediakan dashboard admin untuk memantau seluruh laporan, chat, dan notifikasi.</w:t>
+        <w:t>Menyediakan dashboard admin untuk memantau laporan, chat, notifikasi, dan akun pengguna.</w:t>
       </w:r>
     </w:p>
     <w:p>
@@ -990,7 +990,7 @@
                 <w:color w:val="14231D"/>
                 <w:sz w:val="16"/>
               </w:rPr>
-              <w:t>Melihat seluruh data laporan, chat, notifikasi, dan memantau aktivitas</w:t>
+              <w:t>Melihat laporan, chat, notifikasi, pengguna, dan mengelola akun</w:t>
             </w:r>
           </w:p>
         </w:tc>
@@ -2138,6 +2138,374 @@
           </w:p>
         </w:tc>
       </w:tr>
+      <w:tr>
+        <w:tc>
+          <w:tcPr>
+            <w:tcW w:type="dxa" w:w="1134"/>
+            <w:vAlign w:val="center"/>
+            <w:shd w:fill="FFFFFF"/>
+            <w:tcBorders>
+              <w:top w:val="single" w:sz="8" w:color="D9E5DE"/>
+              <w:left w:val="single" w:sz="8" w:color="D9E5DE"/>
+              <w:bottom w:val="single" w:sz="8" w:color="D9E5DE"/>
+              <w:right w:val="single" w:sz="8" w:color="D9E5DE"/>
+              <w:insideH w:val="single" w:sz="8" w:color="D9E5DE"/>
+              <w:insideV w:val="single" w:sz="8" w:color="D9E5DE"/>
+            </w:tcBorders>
+          </w:tcPr>
+          <w:p>
+            <w:pPr>
+              <w:spacing w:after="0"/>
+            </w:pPr>
+            <w:r/>
+            <w:r>
+              <w:rPr>
+                <w:rFonts w:ascii="Arial" w:hAnsi="Arial"/>
+                <w:b w:val="0"/>
+                <w:color w:val="14231D"/>
+                <w:sz w:val="14"/>
+              </w:rPr>
+              <w:t>F-12</w:t>
+            </w:r>
+          </w:p>
+        </w:tc>
+        <w:tc>
+          <w:tcPr>
+            <w:tcW w:type="dxa" w:w="5669"/>
+            <w:vAlign w:val="center"/>
+            <w:shd w:fill="FFFFFF"/>
+            <w:tcBorders>
+              <w:top w:val="single" w:sz="8" w:color="D9E5DE"/>
+              <w:left w:val="single" w:sz="8" w:color="D9E5DE"/>
+              <w:bottom w:val="single" w:sz="8" w:color="D9E5DE"/>
+              <w:right w:val="single" w:sz="8" w:color="D9E5DE"/>
+              <w:insideH w:val="single" w:sz="8" w:color="D9E5DE"/>
+              <w:insideV w:val="single" w:sz="8" w:color="D9E5DE"/>
+            </w:tcBorders>
+          </w:tcPr>
+          <w:p>
+            <w:pPr>
+              <w:spacing w:after="0"/>
+            </w:pPr>
+            <w:r/>
+            <w:r>
+              <w:rPr>
+                <w:rFonts w:ascii="Arial" w:hAnsi="Arial"/>
+                <w:b w:val="0"/>
+                <w:color w:val="14231D"/>
+                <w:sz w:val="14"/>
+              </w:rPr>
+              <w:t>Melihat jumlah laporan selesai dan daftar laporan lengkap</w:t>
+            </w:r>
+          </w:p>
+        </w:tc>
+        <w:tc>
+          <w:tcPr>
+            <w:tcW w:type="dxa" w:w="1701"/>
+            <w:vAlign w:val="center"/>
+            <w:shd w:fill="FFFFFF"/>
+            <w:tcBorders>
+              <w:top w:val="single" w:sz="8" w:color="D9E5DE"/>
+              <w:left w:val="single" w:sz="8" w:color="D9E5DE"/>
+              <w:bottom w:val="single" w:sz="8" w:color="D9E5DE"/>
+              <w:right w:val="single" w:sz="8" w:color="D9E5DE"/>
+              <w:insideH w:val="single" w:sz="8" w:color="D9E5DE"/>
+              <w:insideV w:val="single" w:sz="8" w:color="D9E5DE"/>
+            </w:tcBorders>
+          </w:tcPr>
+          <w:p>
+            <w:pPr>
+              <w:spacing w:after="0"/>
+            </w:pPr>
+            <w:r/>
+            <w:r>
+              <w:rPr>
+                <w:rFonts w:ascii="Arial" w:hAnsi="Arial"/>
+                <w:b w:val="0"/>
+                <w:color w:val="14231D"/>
+                <w:sz w:val="14"/>
+              </w:rPr>
+              <w:t>Admin</w:t>
+            </w:r>
+          </w:p>
+        </w:tc>
+      </w:tr>
+      <w:tr>
+        <w:tc>
+          <w:tcPr>
+            <w:tcW w:type="dxa" w:w="1134"/>
+            <w:vAlign w:val="center"/>
+            <w:shd w:fill="F7F5EE"/>
+            <w:tcBorders>
+              <w:top w:val="single" w:sz="8" w:color="D9E5DE"/>
+              <w:left w:val="single" w:sz="8" w:color="D9E5DE"/>
+              <w:bottom w:val="single" w:sz="8" w:color="D9E5DE"/>
+              <w:right w:val="single" w:sz="8" w:color="D9E5DE"/>
+              <w:insideH w:val="single" w:sz="8" w:color="D9E5DE"/>
+              <w:insideV w:val="single" w:sz="8" w:color="D9E5DE"/>
+            </w:tcBorders>
+          </w:tcPr>
+          <w:p>
+            <w:pPr>
+              <w:spacing w:after="0"/>
+            </w:pPr>
+            <w:r/>
+            <w:r>
+              <w:rPr>
+                <w:rFonts w:ascii="Arial" w:hAnsi="Arial"/>
+                <w:b w:val="0"/>
+                <w:color w:val="14231D"/>
+                <w:sz w:val="14"/>
+              </w:rPr>
+              <w:t>F-13</w:t>
+            </w:r>
+          </w:p>
+        </w:tc>
+        <w:tc>
+          <w:tcPr>
+            <w:tcW w:type="dxa" w:w="5669"/>
+            <w:vAlign w:val="center"/>
+            <w:shd w:fill="F7F5EE"/>
+            <w:tcBorders>
+              <w:top w:val="single" w:sz="8" w:color="D9E5DE"/>
+              <w:left w:val="single" w:sz="8" w:color="D9E5DE"/>
+              <w:bottom w:val="single" w:sz="8" w:color="D9E5DE"/>
+              <w:right w:val="single" w:sz="8" w:color="D9E5DE"/>
+              <w:insideH w:val="single" w:sz="8" w:color="D9E5DE"/>
+              <w:insideV w:val="single" w:sz="8" w:color="D9E5DE"/>
+            </w:tcBorders>
+          </w:tcPr>
+          <w:p>
+            <w:pPr>
+              <w:spacing w:after="0"/>
+            </w:pPr>
+            <w:r/>
+            <w:r>
+              <w:rPr>
+                <w:rFonts w:ascii="Arial" w:hAnsi="Arial"/>
+                <w:b w:val="0"/>
+                <w:color w:val="14231D"/>
+                <w:sz w:val="14"/>
+              </w:rPr>
+              <w:t>Melihat nama, email, NIM, dan status aktivitas pengguna</w:t>
+            </w:r>
+          </w:p>
+        </w:tc>
+        <w:tc>
+          <w:tcPr>
+            <w:tcW w:type="dxa" w:w="1701"/>
+            <w:vAlign w:val="center"/>
+            <w:shd w:fill="F7F5EE"/>
+            <w:tcBorders>
+              <w:top w:val="single" w:sz="8" w:color="D9E5DE"/>
+              <w:left w:val="single" w:sz="8" w:color="D9E5DE"/>
+              <w:bottom w:val="single" w:sz="8" w:color="D9E5DE"/>
+              <w:right w:val="single" w:sz="8" w:color="D9E5DE"/>
+              <w:insideH w:val="single" w:sz="8" w:color="D9E5DE"/>
+              <w:insideV w:val="single" w:sz="8" w:color="D9E5DE"/>
+            </w:tcBorders>
+          </w:tcPr>
+          <w:p>
+            <w:pPr>
+              <w:spacing w:after="0"/>
+            </w:pPr>
+            <w:r/>
+            <w:r>
+              <w:rPr>
+                <w:rFonts w:ascii="Arial" w:hAnsi="Arial"/>
+                <w:b w:val="0"/>
+                <w:color w:val="14231D"/>
+                <w:sz w:val="14"/>
+              </w:rPr>
+              <w:t>Admin</w:t>
+            </w:r>
+          </w:p>
+        </w:tc>
+      </w:tr>
+      <w:tr>
+        <w:tc>
+          <w:tcPr>
+            <w:tcW w:type="dxa" w:w="1134"/>
+            <w:vAlign w:val="center"/>
+            <w:shd w:fill="FFFFFF"/>
+            <w:tcBorders>
+              <w:top w:val="single" w:sz="8" w:color="D9E5DE"/>
+              <w:left w:val="single" w:sz="8" w:color="D9E5DE"/>
+              <w:bottom w:val="single" w:sz="8" w:color="D9E5DE"/>
+              <w:right w:val="single" w:sz="8" w:color="D9E5DE"/>
+              <w:insideH w:val="single" w:sz="8" w:color="D9E5DE"/>
+              <w:insideV w:val="single" w:sz="8" w:color="D9E5DE"/>
+            </w:tcBorders>
+          </w:tcPr>
+          <w:p>
+            <w:pPr>
+              <w:spacing w:after="0"/>
+            </w:pPr>
+            <w:r/>
+            <w:r>
+              <w:rPr>
+                <w:rFonts w:ascii="Arial" w:hAnsi="Arial"/>
+                <w:b w:val="0"/>
+                <w:color w:val="14231D"/>
+                <w:sz w:val="14"/>
+              </w:rPr>
+              <w:t>F-14</w:t>
+            </w:r>
+          </w:p>
+        </w:tc>
+        <w:tc>
+          <w:tcPr>
+            <w:tcW w:type="dxa" w:w="5669"/>
+            <w:vAlign w:val="center"/>
+            <w:shd w:fill="FFFFFF"/>
+            <w:tcBorders>
+              <w:top w:val="single" w:sz="8" w:color="D9E5DE"/>
+              <w:left w:val="single" w:sz="8" w:color="D9E5DE"/>
+              <w:bottom w:val="single" w:sz="8" w:color="D9E5DE"/>
+              <w:right w:val="single" w:sz="8" w:color="D9E5DE"/>
+              <w:insideH w:val="single" w:sz="8" w:color="D9E5DE"/>
+              <w:insideV w:val="single" w:sz="8" w:color="D9E5DE"/>
+            </w:tcBorders>
+          </w:tcPr>
+          <w:p>
+            <w:pPr>
+              <w:spacing w:after="0"/>
+            </w:pPr>
+            <w:r/>
+            <w:r>
+              <w:rPr>
+                <w:rFonts w:ascii="Arial" w:hAnsi="Arial"/>
+                <w:b w:val="0"/>
+                <w:color w:val="14231D"/>
+                <w:sz w:val="14"/>
+              </w:rPr>
+              <w:t>Mengubah identitas atau menghapus akun pengguna</w:t>
+            </w:r>
+          </w:p>
+        </w:tc>
+        <w:tc>
+          <w:tcPr>
+            <w:tcW w:type="dxa" w:w="1701"/>
+            <w:vAlign w:val="center"/>
+            <w:shd w:fill="FFFFFF"/>
+            <w:tcBorders>
+              <w:top w:val="single" w:sz="8" w:color="D9E5DE"/>
+              <w:left w:val="single" w:sz="8" w:color="D9E5DE"/>
+              <w:bottom w:val="single" w:sz="8" w:color="D9E5DE"/>
+              <w:right w:val="single" w:sz="8" w:color="D9E5DE"/>
+              <w:insideH w:val="single" w:sz="8" w:color="D9E5DE"/>
+              <w:insideV w:val="single" w:sz="8" w:color="D9E5DE"/>
+            </w:tcBorders>
+          </w:tcPr>
+          <w:p>
+            <w:pPr>
+              <w:spacing w:after="0"/>
+            </w:pPr>
+            <w:r/>
+            <w:r>
+              <w:rPr>
+                <w:rFonts w:ascii="Arial" w:hAnsi="Arial"/>
+                <w:b w:val="0"/>
+                <w:color w:val="14231D"/>
+                <w:sz w:val="14"/>
+              </w:rPr>
+              <w:t>Admin</w:t>
+            </w:r>
+          </w:p>
+        </w:tc>
+      </w:tr>
+      <w:tr>
+        <w:tc>
+          <w:tcPr>
+            <w:tcW w:type="dxa" w:w="1134"/>
+            <w:vAlign w:val="center"/>
+            <w:shd w:fill="F7F5EE"/>
+            <w:tcBorders>
+              <w:top w:val="single" w:sz="8" w:color="D9E5DE"/>
+              <w:left w:val="single" w:sz="8" w:color="D9E5DE"/>
+              <w:bottom w:val="single" w:sz="8" w:color="D9E5DE"/>
+              <w:right w:val="single" w:sz="8" w:color="D9E5DE"/>
+              <w:insideH w:val="single" w:sz="8" w:color="D9E5DE"/>
+              <w:insideV w:val="single" w:sz="8" w:color="D9E5DE"/>
+            </w:tcBorders>
+          </w:tcPr>
+          <w:p>
+            <w:pPr>
+              <w:spacing w:after="0"/>
+            </w:pPr>
+            <w:r/>
+            <w:r>
+              <w:rPr>
+                <w:rFonts w:ascii="Arial" w:hAnsi="Arial"/>
+                <w:b w:val="0"/>
+                <w:color w:val="14231D"/>
+                <w:sz w:val="14"/>
+              </w:rPr>
+              <w:t>F-15</w:t>
+            </w:r>
+          </w:p>
+        </w:tc>
+        <w:tc>
+          <w:tcPr>
+            <w:tcW w:type="dxa" w:w="5669"/>
+            <w:vAlign w:val="center"/>
+            <w:shd w:fill="F7F5EE"/>
+            <w:tcBorders>
+              <w:top w:val="single" w:sz="8" w:color="D9E5DE"/>
+              <w:left w:val="single" w:sz="8" w:color="D9E5DE"/>
+              <w:bottom w:val="single" w:sz="8" w:color="D9E5DE"/>
+              <w:right w:val="single" w:sz="8" w:color="D9E5DE"/>
+              <w:insideH w:val="single" w:sz="8" w:color="D9E5DE"/>
+              <w:insideV w:val="single" w:sz="8" w:color="D9E5DE"/>
+            </w:tcBorders>
+          </w:tcPr>
+          <w:p>
+            <w:pPr>
+              <w:spacing w:after="0"/>
+            </w:pPr>
+            <w:r/>
+            <w:r>
+              <w:rPr>
+                <w:rFonts w:ascii="Arial" w:hAnsi="Arial"/>
+                <w:b w:val="0"/>
+                <w:color w:val="14231D"/>
+                <w:sz w:val="14"/>
+              </w:rPr>
+              <w:t>Layout web mengikuti lebar desktop dan menyesuaikan tablet/ponsel</w:t>
+            </w:r>
+          </w:p>
+        </w:tc>
+        <w:tc>
+          <w:tcPr>
+            <w:tcW w:type="dxa" w:w="1701"/>
+            <w:vAlign w:val="center"/>
+            <w:shd w:fill="F7F5EE"/>
+            <w:tcBorders>
+              <w:top w:val="single" w:sz="8" w:color="D9E5DE"/>
+              <w:left w:val="single" w:sz="8" w:color="D9E5DE"/>
+              <w:bottom w:val="single" w:sz="8" w:color="D9E5DE"/>
+              <w:right w:val="single" w:sz="8" w:color="D9E5DE"/>
+              <w:insideH w:val="single" w:sz="8" w:color="D9E5DE"/>
+              <w:insideV w:val="single" w:sz="8" w:color="D9E5DE"/>
+            </w:tcBorders>
+          </w:tcPr>
+          <w:p>
+            <w:pPr>
+              <w:spacing w:after="0"/>
+            </w:pPr>
+            <w:r/>
+            <w:r>
+              <w:rPr>
+                <w:rFonts w:ascii="Arial" w:hAnsi="Arial"/>
+                <w:b w:val="0"/>
+                <w:color w:val="14231D"/>
+                <w:sz w:val="14"/>
+              </w:rPr>
+              <w:t>Semua pengguna</w:t>
+            </w:r>
+          </w:p>
+        </w:tc>
+      </w:tr>
     </w:tbl>
     <w:p>
       <w:pPr>
@@ -3216,7 +3584,7 @@
                 <w:color w:val="14231D"/>
                 <w:sz w:val="14"/>
               </w:rPr>
-              <w:t>Admin membuka tab laporan, chat, atau notifikasi.</w:t>
+              <w:t>Admin membuka tab laporan, chat, notifikasi, atau pengguna.</w:t>
             </w:r>
           </w:p>
         </w:tc>
@@ -3246,7 +3614,7 @@
                 <w:color w:val="14231D"/>
                 <w:sz w:val="14"/>
               </w:rPr>
-              <w:t>Admin melihat seluruh data</w:t>
+              <w:t>Admin melihat ringkasan serta data sesuai tab</w:t>
             </w:r>
           </w:p>
         </w:tc>
@@ -3491,6 +3859,128 @@
                 <w:sz w:val="14"/>
               </w:rPr>
               <w:t>Laporan terhapus untuk semua akun; akun lain ditolak</w:t>
+            </w:r>
+          </w:p>
+        </w:tc>
+      </w:tr>
+      <w:tr>
+        <w:tc>
+          <w:tcPr>
+            <w:tcW w:type="dxa" w:w="1134"/>
+            <w:vAlign w:val="center"/>
+            <w:shd w:fill="FFFFFF"/>
+            <w:tcBorders>
+              <w:top w:val="single" w:sz="8" w:color="D9E5DE"/>
+              <w:left w:val="single" w:sz="8" w:color="D9E5DE"/>
+              <w:bottom w:val="single" w:sz="8" w:color="D9E5DE"/>
+              <w:right w:val="single" w:sz="8" w:color="D9E5DE"/>
+              <w:insideH w:val="single" w:sz="8" w:color="D9E5DE"/>
+              <w:insideV w:val="single" w:sz="8" w:color="D9E5DE"/>
+            </w:tcBorders>
+          </w:tcPr>
+          <w:p>
+            <w:pPr>
+              <w:spacing w:after="0"/>
+            </w:pPr>
+            <w:r/>
+            <w:r>
+              <w:rPr>
+                <w:rFonts w:ascii="Arial" w:hAnsi="Arial"/>
+                <w:b w:val="0"/>
+                <w:color w:val="14231D"/>
+                <w:sz w:val="14"/>
+              </w:rPr>
+              <w:t>UC-10</w:t>
+            </w:r>
+          </w:p>
+        </w:tc>
+        <w:tc>
+          <w:tcPr>
+            <w:tcW w:type="dxa" w:w="1701"/>
+            <w:vAlign w:val="center"/>
+            <w:shd w:fill="FFFFFF"/>
+            <w:tcBorders>
+              <w:top w:val="single" w:sz="8" w:color="D9E5DE"/>
+              <w:left w:val="single" w:sz="8" w:color="D9E5DE"/>
+              <w:bottom w:val="single" w:sz="8" w:color="D9E5DE"/>
+              <w:right w:val="single" w:sz="8" w:color="D9E5DE"/>
+              <w:insideH w:val="single" w:sz="8" w:color="D9E5DE"/>
+              <w:insideV w:val="single" w:sz="8" w:color="D9E5DE"/>
+            </w:tcBorders>
+          </w:tcPr>
+          <w:p>
+            <w:pPr>
+              <w:spacing w:after="0"/>
+            </w:pPr>
+            <w:r/>
+            <w:r>
+              <w:rPr>
+                <w:rFonts w:ascii="Arial" w:hAnsi="Arial"/>
+                <w:b w:val="0"/>
+                <w:color w:val="14231D"/>
+                <w:sz w:val="14"/>
+              </w:rPr>
+              <w:t>Kelola akun pengguna</w:t>
+            </w:r>
+          </w:p>
+        </w:tc>
+        <w:tc>
+          <w:tcPr>
+            <w:tcW w:type="dxa" w:w="4535"/>
+            <w:vAlign w:val="center"/>
+            <w:shd w:fill="FFFFFF"/>
+            <w:tcBorders>
+              <w:top w:val="single" w:sz="8" w:color="D9E5DE"/>
+              <w:left w:val="single" w:sz="8" w:color="D9E5DE"/>
+              <w:bottom w:val="single" w:sz="8" w:color="D9E5DE"/>
+              <w:right w:val="single" w:sz="8" w:color="D9E5DE"/>
+              <w:insideH w:val="single" w:sz="8" w:color="D9E5DE"/>
+              <w:insideV w:val="single" w:sz="8" w:color="D9E5DE"/>
+            </w:tcBorders>
+          </w:tcPr>
+          <w:p>
+            <w:pPr>
+              <w:spacing w:after="0"/>
+            </w:pPr>
+            <w:r/>
+            <w:r>
+              <w:rPr>
+                <w:rFonts w:ascii="Arial" w:hAnsi="Arial"/>
+                <w:b w:val="0"/>
+                <w:color w:val="14231D"/>
+                <w:sz w:val="14"/>
+              </w:rPr>
+              <w:t>Admin meninjau identitas dan status pengguna, lalu memilih ubah atau hapus.</w:t>
+            </w:r>
+          </w:p>
+        </w:tc>
+        <w:tc>
+          <w:tcPr>
+            <w:tcW w:type="dxa" w:w="1701"/>
+            <w:vAlign w:val="center"/>
+            <w:shd w:fill="FFFFFF"/>
+            <w:tcBorders>
+              <w:top w:val="single" w:sz="8" w:color="D9E5DE"/>
+              <w:left w:val="single" w:sz="8" w:color="D9E5DE"/>
+              <w:bottom w:val="single" w:sz="8" w:color="D9E5DE"/>
+              <w:right w:val="single" w:sz="8" w:color="D9E5DE"/>
+              <w:insideH w:val="single" w:sz="8" w:color="D9E5DE"/>
+              <w:insideV w:val="single" w:sz="8" w:color="D9E5DE"/>
+            </w:tcBorders>
+          </w:tcPr>
+          <w:p>
+            <w:pPr>
+              <w:spacing w:after="0"/>
+            </w:pPr>
+            <w:r/>
+            <w:r>
+              <w:rPr>
+                <w:rFonts w:ascii="Arial" w:hAnsi="Arial"/>
+                <w:b w:val="0"/>
+                <w:color w:val="14231D"/>
+                <w:sz w:val="14"/>
+              </w:rPr>
+              <w:t>Akun diperbarui atau dihapus dengan laporan tetap dipertahankan</w:t>
             </w:r>
           </w:p>
         </w:tc>
@@ -4976,7 +5466,7 @@
                 <w:color w:val="14231D"/>
                 <w:sz w:val="16"/>
               </w:rPr>
-              <w:t>AppBar admin - kartu statistik - tab Laporan, Chat, Notifikasi - detail data</w:t>
+              <w:t>AppBar admin - statistik laporan/selesai/pengguna/chat - tab Laporan, Chat, Notifikasi, Pengguna - aksi ubah/hapus akun</w:t>
             </w:r>
           </w:p>
         </w:tc>
@@ -4997,7 +5487,7 @@
     </w:p>
     <w:p>
       <w:r>
-        <w:t>Purwarupa dikembangkan dengan nuansa UIN Malang melalui warna hijau tua, hijau utama, emas, dan sand. Logo UIN digunakan sebagai identitas visual pada login, dashboard, AppBar, dan halaman admin. Komponen Material 3 dipakai agar tampilan konsisten pada perangkat berbeda.</w:t>
+        <w:t>Purwarupa dikembangkan dengan nuansa UIN Malang melalui warna hijau tua, hijau utama, emas, dan sand. Logo UIN digunakan sebagai identitas visual pada login, dashboard, AppBar, dan halaman admin. Komponen Material 3 dipakai agar tampilan konsisten pada perangkat berbeda. Layout web menggunakan lebar yang tersedia pada desktop dan menyesuaikan pada tablet maupun ponsel.</w:t>
       </w:r>
     </w:p>
     <w:tbl>
@@ -5118,6 +5608,72 @@
                 <w:sz w:val="18"/>
               </w:rPr>
               <w:t>Tempel screenshot form laporan, chat, badge pesan, serta status online.</w:t>
+            </w:r>
+          </w:p>
+          <w:p/>
+          <w:p/>
+          <w:p/>
+          <w:p/>
+        </w:tc>
+      </w:tr>
+    </w:tbl>
+    <w:p>
+      <w:pPr>
+        <w:spacing w:after="0"/>
+      </w:pPr>
+    </w:p>
+    <w:tbl>
+      <w:tblPr>
+        <w:tblW w:type="auto" w:w="0"/>
+        <w:jc w:val="center"/>
+        <w:tblLook w:firstColumn="1" w:firstRow="1" w:lastColumn="0" w:lastRow="0" w:noHBand="0" w:noVBand="1" w:val="04A0"/>
+      </w:tblPr>
+      <w:tblGrid>
+        <w:gridCol w:w="9745"/>
+      </w:tblGrid>
+      <w:tr>
+        <w:tc>
+          <w:tcPr>
+            <w:tcW w:type="dxa" w:w="9745"/>
+            <w:shd w:fill="F2F7F4"/>
+            <w:tcBorders>
+              <w:top w:val="single" w:sz="14" w:color="8BB9A2"/>
+              <w:left w:val="single" w:sz="14" w:color="8BB9A2"/>
+              <w:bottom w:val="single" w:sz="14" w:color="8BB9A2"/>
+              <w:right w:val="single" w:sz="14" w:color="8BB9A2"/>
+              <w:insideH w:val="single" w:sz="14" w:color="8BB9A2"/>
+              <w:insideV w:val="single" w:sz="14" w:color="8BB9A2"/>
+            </w:tcBorders>
+            <w:vAlign w:val="center"/>
+          </w:tcPr>
+          <w:p>
+            <w:pPr>
+              <w:spacing w:before="240" w:after="100"/>
+              <w:jc w:val="center"/>
+            </w:pPr>
+            <w:r/>
+            <w:r>
+              <w:rPr>
+                <w:b/>
+                <w:color w:val="006B45"/>
+                <w:sz w:val="26"/>
+              </w:rPr>
+              <w:t>SCREENSHOT BUKTI</w:t>
+              <w:br/>
+              <w:t>Layout web responsif</w:t>
+            </w:r>
+          </w:p>
+          <w:p>
+            <w:pPr>
+              <w:spacing w:after="240"/>
+              <w:jc w:val="center"/>
+            </w:pPr>
+            <w:r>
+              <w:rPr>
+                <w:color w:val="6F7D76"/>
+                <w:sz w:val="18"/>
+              </w:rPr>
+              <w:t>Tempel screenshot desktop lebar dan tampilan ponsel/tablet yang menunjukkan layout mengikuti viewport.</w:t>
             </w:r>
           </w:p>
           <w:p/>
@@ -5842,7 +6398,16 @@
         <w:spacing w:after="40"/>
       </w:pPr>
       <w:r>
-        <w:t>Login admin berhasil menuju AdminDashboardScreen yang memiliki tab Laporan, Chat, dan Notifikasi.</w:t>
+        <w:t>Login admin berhasil menuju AdminDashboardScreen dengan tab Laporan, Chat, Notifikasi, dan Pengguna.</w:t>
+      </w:r>
+    </w:p>
+    <w:p>
+      <w:pPr>
+        <w:pStyle w:val="ListBullet"/>
+        <w:spacing w:after="40"/>
+      </w:pPr>
+      <w:r>
+        <w:t>ResponsivePage membuat konten memanfaatkan ruang layar desktop yang lebar dan menyesuaikan pada tablet/ponsel.</w:t>
       </w:r>
     </w:p>
     <w:p>
@@ -6323,7 +6888,7 @@
     </w:p>
     <w:p>
       <w:r>
-        <w:t>AppDataRepository menjadi penghubung UI dan API; MySQL/MariaDB adalah sumber data bersama untuk seluruh akun. Hive menyimpan salinan lokal perangkat, sementara data akun tidak diambil dari cache lokal ketika API gagal. Aplikasi menarik data baru setiap lima detik dan saat pengguna menyegarkan Jelajah. Laporan dari akun mana pun dikirim ke server dan ditampilkan pada semua akun. Percakapan dibuat per laporan dan pasangan akun; pesan ditambahkan sebagai record baru melalui endpoint khusus, sedangkan snapshot sync tidak pernah menulis ulang pesan. Endpoint admin memakai token sesi untuk memuat seluruh data.</w:t>
+        <w:t>AppDataRepository menjadi penghubung UI dan API; MySQL/MariaDB adalah sumber data bersama untuk seluruh akun. Hive menyimpan salinan lokal perangkat, sementara data akun tidak diambil dari cache lokal ketika API gagal. Aplikasi menarik data baru setiap lima detik dan saat pengguna menyegarkan Jelajah. Laporan dari akun mana pun dikirim ke server dan ditampilkan pada semua akun. Percakapan dibuat per laporan dan pasangan akun; pesan ditambahkan sebagai record baru melalui endpoint khusus, sedangkan snapshot sync tidak pernah menulis ulang pesan. Endpoint admin memakai token sesi untuk memuat seluruh data termasuk daftar pengguna. Admin dapat mengubah NIM, email kampus, dan nama, atau menghapus akun. Penghapusan akun tidak menghapus laporan; identitas pemilik laporan dilepas sesuai relasi database.</w:t>
       </w:r>
     </w:p>
     <w:tbl>
@@ -6410,6 +6975,33 @@
       </w:pPr>
       <w:r>
         <w:t>Login admin dan dashboard monitoring terpisah dari dashboard mahasiswa.</w:t>
+      </w:r>
+    </w:p>
+    <w:p>
+      <w:pPr>
+        <w:pStyle w:val="ListBullet"/>
+        <w:spacing w:after="40"/>
+      </w:pPr>
+      <w:r>
+        <w:t>Dashboard admin menampilkan jumlah laporan, laporan selesai, pengguna, dan percakapan; setiap laporan dapat dibuka untuk melihat detail.</w:t>
+      </w:r>
+    </w:p>
+    <w:p>
+      <w:pPr>
+        <w:pStyle w:val="ListBullet"/>
+        <w:spacing w:after="40"/>
+      </w:pPr>
+      <w:r>
+        <w:t>Tab Pengguna menampilkan nama, email, NIM, online/last seen, serta tindakan ubah dan hapus akun.</w:t>
+      </w:r>
+    </w:p>
+    <w:p>
+      <w:pPr>
+        <w:pStyle w:val="ListBullet"/>
+        <w:spacing w:after="40"/>
+      </w:pPr>
+      <w:r>
+        <w:t>Layout web responsif memanfaatkan lebar desktop dan menyesuaikan tablet/ponsel.</w:t>
       </w:r>
     </w:p>
     <w:p>
@@ -7419,7 +8011,7 @@
                 <w:color w:val="14231D"/>
                 <w:sz w:val="16"/>
               </w:rPr>
-              <w:t>Mengembalikan seluruh laporan, chat, dan notifikasi</w:t>
+              <w:t>Mengembalikan seluruh laporan, chat, notifikasi, dan daftar pengguna</w:t>
             </w:r>
           </w:p>
         </w:tc>
@@ -7695,7 +8287,7 @@
                 <w:color w:val="14231D"/>
                 <w:sz w:val="16"/>
               </w:rPr>
-              <w:t>Database aktif; pemeriksaan mengembalikan 3 laporan, 1 chat, dan 2 notifikasi</w:t>
+              <w:t>Database aktif; pemeriksaan data bersama berhasil</w:t>
             </w:r>
           </w:p>
         </w:tc>
@@ -8843,7 +9435,7 @@
                 <w:color w:val="14231D"/>
                 <w:sz w:val="14"/>
               </w:rPr>
-              <w:t>Login admin lalu screenshot statistik dan tab Laporan/Chat/Notifikasi.</w:t>
+              <w:t>Login admin lalu screenshot statistik dan tab Laporan/Chat/Notifikasi/Pengguna.</w:t>
             </w:r>
           </w:p>
         </w:tc>
@@ -9124,6 +9716,190 @@
           </w:p>
         </w:tc>
       </w:tr>
+      <w:tr>
+        <w:tc>
+          <w:tcPr>
+            <w:tcW w:type="dxa" w:w="680"/>
+            <w:vAlign w:val="center"/>
+            <w:shd w:fill="FFFFFF"/>
+            <w:tcBorders>
+              <w:top w:val="single" w:sz="8" w:color="D9E5DE"/>
+              <w:left w:val="single" w:sz="8" w:color="D9E5DE"/>
+              <w:bottom w:val="single" w:sz="8" w:color="D9E5DE"/>
+              <w:right w:val="single" w:sz="8" w:color="D9E5DE"/>
+              <w:insideH w:val="single" w:sz="8" w:color="D9E5DE"/>
+              <w:insideV w:val="single" w:sz="8" w:color="D9E5DE"/>
+            </w:tcBorders>
+          </w:tcPr>
+          <w:p>
+            <w:pPr>
+              <w:spacing w:after="0"/>
+            </w:pPr>
+            <w:r/>
+            <w:r>
+              <w:rPr>
+                <w:rFonts w:ascii="Arial" w:hAnsi="Arial"/>
+                <w:b w:val="0"/>
+                <w:color w:val="14231D"/>
+                <w:sz w:val="14"/>
+              </w:rPr>
+              <w:t>12</w:t>
+            </w:r>
+          </w:p>
+        </w:tc>
+        <w:tc>
+          <w:tcPr>
+            <w:tcW w:type="dxa" w:w="3685"/>
+            <w:vAlign w:val="center"/>
+            <w:shd w:fill="FFFFFF"/>
+            <w:tcBorders>
+              <w:top w:val="single" w:sz="8" w:color="D9E5DE"/>
+              <w:left w:val="single" w:sz="8" w:color="D9E5DE"/>
+              <w:bottom w:val="single" w:sz="8" w:color="D9E5DE"/>
+              <w:right w:val="single" w:sz="8" w:color="D9E5DE"/>
+              <w:insideH w:val="single" w:sz="8" w:color="D9E5DE"/>
+              <w:insideV w:val="single" w:sz="8" w:color="D9E5DE"/>
+            </w:tcBorders>
+          </w:tcPr>
+          <w:p>
+            <w:pPr>
+              <w:spacing w:after="0"/>
+            </w:pPr>
+            <w:r/>
+            <w:r>
+              <w:rPr>
+                <w:rFonts w:ascii="Arial" w:hAnsi="Arial"/>
+                <w:b w:val="0"/>
+                <w:color w:val="14231D"/>
+                <w:sz w:val="14"/>
+              </w:rPr>
+              <w:t>Pengelolaan pengguna admin</w:t>
+            </w:r>
+          </w:p>
+        </w:tc>
+        <w:tc>
+          <w:tcPr>
+            <w:tcW w:type="dxa" w:w="5272"/>
+            <w:vAlign w:val="center"/>
+            <w:shd w:fill="FFFFFF"/>
+            <w:tcBorders>
+              <w:top w:val="single" w:sz="8" w:color="D9E5DE"/>
+              <w:left w:val="single" w:sz="8" w:color="D9E5DE"/>
+              <w:bottom w:val="single" w:sz="8" w:color="D9E5DE"/>
+              <w:right w:val="single" w:sz="8" w:color="D9E5DE"/>
+              <w:insideH w:val="single" w:sz="8" w:color="D9E5DE"/>
+              <w:insideV w:val="single" w:sz="8" w:color="D9E5DE"/>
+            </w:tcBorders>
+          </w:tcPr>
+          <w:p>
+            <w:pPr>
+              <w:spacing w:after="0"/>
+            </w:pPr>
+            <w:r/>
+            <w:r>
+              <w:rPr>
+                <w:rFonts w:ascii="Arial" w:hAnsi="Arial"/>
+                <w:b w:val="0"/>
+                <w:color w:val="14231D"/>
+                <w:sz w:val="14"/>
+              </w:rPr>
+              <w:t>Tampilkan tab Pengguna dengan nama, email, NIM, status aktivitas, dan menu ubah/hapus.</w:t>
+            </w:r>
+          </w:p>
+        </w:tc>
+      </w:tr>
+      <w:tr>
+        <w:tc>
+          <w:tcPr>
+            <w:tcW w:type="dxa" w:w="680"/>
+            <w:vAlign w:val="center"/>
+            <w:shd w:fill="F7F5EE"/>
+            <w:tcBorders>
+              <w:top w:val="single" w:sz="8" w:color="D9E5DE"/>
+              <w:left w:val="single" w:sz="8" w:color="D9E5DE"/>
+              <w:bottom w:val="single" w:sz="8" w:color="D9E5DE"/>
+              <w:right w:val="single" w:sz="8" w:color="D9E5DE"/>
+              <w:insideH w:val="single" w:sz="8" w:color="D9E5DE"/>
+              <w:insideV w:val="single" w:sz="8" w:color="D9E5DE"/>
+            </w:tcBorders>
+          </w:tcPr>
+          <w:p>
+            <w:pPr>
+              <w:spacing w:after="0"/>
+            </w:pPr>
+            <w:r/>
+            <w:r>
+              <w:rPr>
+                <w:rFonts w:ascii="Arial" w:hAnsi="Arial"/>
+                <w:b w:val="0"/>
+                <w:color w:val="14231D"/>
+                <w:sz w:val="14"/>
+              </w:rPr>
+              <w:t>13</w:t>
+            </w:r>
+          </w:p>
+        </w:tc>
+        <w:tc>
+          <w:tcPr>
+            <w:tcW w:type="dxa" w:w="3685"/>
+            <w:vAlign w:val="center"/>
+            <w:shd w:fill="F7F5EE"/>
+            <w:tcBorders>
+              <w:top w:val="single" w:sz="8" w:color="D9E5DE"/>
+              <w:left w:val="single" w:sz="8" w:color="D9E5DE"/>
+              <w:bottom w:val="single" w:sz="8" w:color="D9E5DE"/>
+              <w:right w:val="single" w:sz="8" w:color="D9E5DE"/>
+              <w:insideH w:val="single" w:sz="8" w:color="D9E5DE"/>
+              <w:insideV w:val="single" w:sz="8" w:color="D9E5DE"/>
+            </w:tcBorders>
+          </w:tcPr>
+          <w:p>
+            <w:pPr>
+              <w:spacing w:after="0"/>
+            </w:pPr>
+            <w:r/>
+            <w:r>
+              <w:rPr>
+                <w:rFonts w:ascii="Arial" w:hAnsi="Arial"/>
+                <w:b w:val="0"/>
+                <w:color w:val="14231D"/>
+                <w:sz w:val="14"/>
+              </w:rPr>
+              <w:t>Layout web responsif</w:t>
+            </w:r>
+          </w:p>
+        </w:tc>
+        <w:tc>
+          <w:tcPr>
+            <w:tcW w:type="dxa" w:w="5272"/>
+            <w:vAlign w:val="center"/>
+            <w:shd w:fill="F7F5EE"/>
+            <w:tcBorders>
+              <w:top w:val="single" w:sz="8" w:color="D9E5DE"/>
+              <w:left w:val="single" w:sz="8" w:color="D9E5DE"/>
+              <w:bottom w:val="single" w:sz="8" w:color="D9E5DE"/>
+              <w:right w:val="single" w:sz="8" w:color="D9E5DE"/>
+              <w:insideH w:val="single" w:sz="8" w:color="D9E5DE"/>
+              <w:insideV w:val="single" w:sz="8" w:color="D9E5DE"/>
+            </w:tcBorders>
+          </w:tcPr>
+          <w:p>
+            <w:pPr>
+              <w:spacing w:after="0"/>
+            </w:pPr>
+            <w:r/>
+            <w:r>
+              <w:rPr>
+                <w:rFonts w:ascii="Arial" w:hAnsi="Arial"/>
+                <w:b w:val="0"/>
+                <w:color w:val="14231D"/>
+                <w:sz w:val="14"/>
+              </w:rPr>
+              <w:t>Tampilkan aplikasi pada desktop lebar dan ponsel/tablet; pastikan konten mengikuti ukuran viewport.</w:t>
+            </w:r>
+          </w:p>
+        </w:tc>
+      </w:tr>
     </w:tbl>
     <w:p>
       <w:pPr>
@@ -9295,7 +10071,7 @@
     </w:p>
     <w:p>
       <w:r>
-        <w:t>Dengan adanya dashboard mahasiswa dan dashboard admin, aplikasi telah memiliki pemisahan akses sesuai peran. Identitas mahasiswa dikunci pada email, NIM, dan nama terdaftar. Laporan tersedia lintas akun dari database bersama; chat, pesan, notifikasi, badge, serta status online/last seen dikelola backend. Pemilik dapat menghapus laporannya dan penghapusan berlaku bagi semua akun. Fitur ini melengkapi pencarian, upload foto, penyimpanan data, dan monitoring admin sebagai MVP.</w:t>
+        <w:t>Dengan adanya dashboard mahasiswa dan dashboard admin, aplikasi telah memiliki pemisahan akses sesuai peran. Identitas mahasiswa dikunci pada email, NIM, dan nama terdaftar. Laporan tersedia lintas akun dari database bersama; chat, pesan, notifikasi, badge, serta status online/last seen dikelola backend. Pemilik dapat menghapus laporannya dan penghapusan berlaku bagi semua akun. Fitur ini melengkapi pencarian, upload foto, penyimpanan data, dan monitoring admin sebagai MVP. Admin dapat memantau jumlah dan detail laporan, termasuk jumlah laporan selesai, serta melihat dan mengelola akun pengguna. Layout web mengikuti ruang desktop dan tetap responsif pada tablet maupun ponsel.</w:t>
       </w:r>
     </w:p>
     <w:p>

</xml_diff>